<commit_message>
Additional image added and one image removed. Edited the proposal documented.
</commit_message>
<xml_diff>
--- a/Documents/Zionist Churches Proposal.docx
+++ b/Documents/Zionist Churches Proposal.docx
@@ -471,7 +471,7 @@
           <w:r>
             <w:fldChar w:fldCharType="separate"/>
           </w:r>
-          <w:hyperlink w:anchor="_Toc227181049" w:history="1">
+          <w:hyperlink w:anchor="_Toc227423377" w:history="1">
             <w:r>
               <w:rPr>
                 <w:rStyle w:val="Hyperlink"/>
@@ -498,7 +498,7 @@
                 <w:noProof/>
                 <w:webHidden/>
               </w:rPr>
-              <w:instrText xml:space="preserve"> PAGEREF _Toc227181049 \h </w:instrText>
+              <w:instrText xml:space="preserve"> PAGEREF _Toc227423377 \h </w:instrText>
             </w:r>
             <w:r>
               <w:rPr>
@@ -518,7 +518,7 @@
                 <w:noProof/>
                 <w:webHidden/>
               </w:rPr>
-              <w:t>2</w:t>
+              <w:t>3</w:t>
             </w:r>
             <w:r>
               <w:rPr>
@@ -545,7 +545,7 @@
               <w14:ligatures w14:val="standardContextual"/>
             </w:rPr>
           </w:pPr>
-          <w:hyperlink w:anchor="_Toc227181050" w:history="1">
+          <w:hyperlink w:anchor="_Toc227423378" w:history="1">
             <w:r>
               <w:rPr>
                 <w:rStyle w:val="Hyperlink"/>
@@ -572,7 +572,7 @@
                 <w:noProof/>
                 <w:webHidden/>
               </w:rPr>
-              <w:instrText xml:space="preserve"> PAGEREF _Toc227181050 \h </w:instrText>
+              <w:instrText xml:space="preserve"> PAGEREF _Toc227423378 \h </w:instrText>
             </w:r>
             <w:r>
               <w:rPr>
@@ -592,7 +592,7 @@
                 <w:noProof/>
                 <w:webHidden/>
               </w:rPr>
-              <w:t>2</w:t>
+              <w:t>3</w:t>
             </w:r>
             <w:r>
               <w:rPr>
@@ -619,7 +619,7 @@
               <w14:ligatures w14:val="standardContextual"/>
             </w:rPr>
           </w:pPr>
-          <w:hyperlink w:anchor="_Toc227181051" w:history="1">
+          <w:hyperlink w:anchor="_Toc227423379" w:history="1">
             <w:r>
               <w:rPr>
                 <w:rStyle w:val="Hyperlink"/>
@@ -646,7 +646,7 @@
                 <w:noProof/>
                 <w:webHidden/>
               </w:rPr>
-              <w:instrText xml:space="preserve"> PAGEREF _Toc227181051 \h </w:instrText>
+              <w:instrText xml:space="preserve"> PAGEREF _Toc227423379 \h </w:instrText>
             </w:r>
             <w:r>
               <w:rPr>
@@ -666,7 +666,7 @@
                 <w:noProof/>
                 <w:webHidden/>
               </w:rPr>
-              <w:t>2</w:t>
+              <w:t>3</w:t>
             </w:r>
             <w:r>
               <w:rPr>
@@ -693,7 +693,7 @@
               <w14:ligatures w14:val="standardContextual"/>
             </w:rPr>
           </w:pPr>
-          <w:hyperlink w:anchor="_Toc227181052" w:history="1">
+          <w:hyperlink w:anchor="_Toc227423380" w:history="1">
             <w:r>
               <w:rPr>
                 <w:rStyle w:val="Hyperlink"/>
@@ -720,7 +720,7 @@
                 <w:noProof/>
                 <w:webHidden/>
               </w:rPr>
-              <w:instrText xml:space="preserve"> PAGEREF _Toc227181052 \h </w:instrText>
+              <w:instrText xml:space="preserve"> PAGEREF _Toc227423380 \h </w:instrText>
             </w:r>
             <w:r>
               <w:rPr>
@@ -740,7 +740,7 @@
                 <w:noProof/>
                 <w:webHidden/>
               </w:rPr>
-              <w:t>3</w:t>
+              <w:t>4</w:t>
             </w:r>
             <w:r>
               <w:rPr>
@@ -767,7 +767,7 @@
               <w14:ligatures w14:val="standardContextual"/>
             </w:rPr>
           </w:pPr>
-          <w:hyperlink w:anchor="_Toc227181053" w:history="1">
+          <w:hyperlink w:anchor="_Toc227423381" w:history="1">
             <w:r>
               <w:rPr>
                 <w:rStyle w:val="Hyperlink"/>
@@ -794,7 +794,7 @@
                 <w:noProof/>
                 <w:webHidden/>
               </w:rPr>
-              <w:instrText xml:space="preserve"> PAGEREF _Toc227181053 \h </w:instrText>
+              <w:instrText xml:space="preserve"> PAGEREF _Toc227423381 \h </w:instrText>
             </w:r>
             <w:r>
               <w:rPr>
@@ -814,7 +814,7 @@
                 <w:noProof/>
                 <w:webHidden/>
               </w:rPr>
-              <w:t>3</w:t>
+              <w:t>4</w:t>
             </w:r>
             <w:r>
               <w:rPr>
@@ -841,13 +841,13 @@
               <w14:ligatures w14:val="standardContextual"/>
             </w:rPr>
           </w:pPr>
-          <w:hyperlink w:anchor="_Toc227181054" w:history="1">
+          <w:hyperlink w:anchor="_Toc227423382" w:history="1">
             <w:r>
               <w:rPr>
                 <w:rStyle w:val="Hyperlink"/>
                 <w:noProof/>
               </w:rPr>
-              <w:t>Proposed website features and functionality</w:t>
+              <w:t>Current Website Analysis</w:t>
             </w:r>
             <w:r>
               <w:rPr>
@@ -868,7 +868,7 @@
                 <w:noProof/>
                 <w:webHidden/>
               </w:rPr>
-              <w:instrText xml:space="preserve"> PAGEREF _Toc227181054 \h </w:instrText>
+              <w:instrText xml:space="preserve"> PAGEREF _Toc227423382 \h </w:instrText>
             </w:r>
             <w:r>
               <w:rPr>
@@ -888,7 +888,7 @@
                 <w:noProof/>
                 <w:webHidden/>
               </w:rPr>
-              <w:t>3</w:t>
+              <w:t>4</w:t>
             </w:r>
             <w:r>
               <w:rPr>
@@ -915,12 +915,86 @@
               <w14:ligatures w14:val="standardContextual"/>
             </w:rPr>
           </w:pPr>
-          <w:hyperlink w:anchor="_Toc227181055" w:history="1">
+          <w:hyperlink w:anchor="_Toc227423383" w:history="1">
             <w:r>
               <w:rPr>
                 <w:rStyle w:val="Hyperlink"/>
                 <w:noProof/>
               </w:rPr>
+              <w:t>Proposed website features and functionality</w:t>
+            </w:r>
+            <w:r>
+              <w:rPr>
+                <w:noProof/>
+                <w:webHidden/>
+              </w:rPr>
+              <w:tab/>
+            </w:r>
+            <w:r>
+              <w:rPr>
+                <w:noProof/>
+                <w:webHidden/>
+              </w:rPr>
+              <w:fldChar w:fldCharType="begin"/>
+            </w:r>
+            <w:r>
+              <w:rPr>
+                <w:noProof/>
+                <w:webHidden/>
+              </w:rPr>
+              <w:instrText xml:space="preserve"> PAGEREF _Toc227423383 \h </w:instrText>
+            </w:r>
+            <w:r>
+              <w:rPr>
+                <w:noProof/>
+                <w:webHidden/>
+              </w:rPr>
+            </w:r>
+            <w:r>
+              <w:rPr>
+                <w:noProof/>
+                <w:webHidden/>
+              </w:rPr>
+              <w:fldChar w:fldCharType="separate"/>
+            </w:r>
+            <w:r>
+              <w:rPr>
+                <w:noProof/>
+                <w:webHidden/>
+              </w:rPr>
+              <w:t>5</w:t>
+            </w:r>
+            <w:r>
+              <w:rPr>
+                <w:noProof/>
+                <w:webHidden/>
+              </w:rPr>
+              <w:fldChar w:fldCharType="end"/>
+            </w:r>
+          </w:hyperlink>
+        </w:p>
+        <w:p>
+          <w:pPr>
+            <w:pStyle w:val="TOC1"/>
+            <w:tabs>
+              <w:tab w:val="right" w:leader="dot" w:pos="9016"/>
+            </w:tabs>
+            <w:rPr>
+              <w:rFonts w:eastAsiaTheme="minorEastAsia"/>
+              <w:noProof/>
+              <w:kern w:val="2"/>
+              <w:sz w:val="24"/>
+              <w:szCs w:val="24"/>
+              <w:lang w:eastAsia="en-ZA"/>
+              <w14:ligatures w14:val="standardContextual"/>
+            </w:rPr>
+          </w:pPr>
+          <w:hyperlink w:anchor="_Toc227423384" w:history="1">
+            <w:r>
+              <w:rPr>
+                <w:rStyle w:val="Hyperlink"/>
+                <w:noProof/>
+              </w:rPr>
               <w:t>Design and User Experience</w:t>
             </w:r>
             <w:r>
@@ -942,7 +1016,7 @@
                 <w:noProof/>
                 <w:webHidden/>
               </w:rPr>
-              <w:instrText xml:space="preserve"> PAGEREF _Toc227181055 \h </w:instrText>
+              <w:instrText xml:space="preserve"> PAGEREF _Toc227423384 \h </w:instrText>
             </w:r>
             <w:r>
               <w:rPr>
@@ -962,7 +1036,7 @@
                 <w:noProof/>
                 <w:webHidden/>
               </w:rPr>
-              <w:t>4</w:t>
+              <w:t>5</w:t>
             </w:r>
             <w:r>
               <w:rPr>
@@ -989,7 +1063,7 @@
               <w14:ligatures w14:val="standardContextual"/>
             </w:rPr>
           </w:pPr>
-          <w:hyperlink w:anchor="_Toc227181056" w:history="1">
+          <w:hyperlink w:anchor="_Toc227423385" w:history="1">
             <w:r>
               <w:rPr>
                 <w:rStyle w:val="Hyperlink"/>
@@ -1016,7 +1090,7 @@
                 <w:noProof/>
                 <w:webHidden/>
               </w:rPr>
-              <w:instrText xml:space="preserve"> PAGEREF _Toc227181056 \h </w:instrText>
+              <w:instrText xml:space="preserve"> PAGEREF _Toc227423385 \h </w:instrText>
             </w:r>
             <w:r>
               <w:rPr>
@@ -1036,7 +1110,7 @@
                 <w:noProof/>
                 <w:webHidden/>
               </w:rPr>
-              <w:t>4</w:t>
+              <w:t>5</w:t>
             </w:r>
             <w:r>
               <w:rPr>
@@ -1063,7 +1137,7 @@
               <w14:ligatures w14:val="standardContextual"/>
             </w:rPr>
           </w:pPr>
-          <w:hyperlink w:anchor="_Toc227181057" w:history="1">
+          <w:hyperlink w:anchor="_Toc227423386" w:history="1">
             <w:r>
               <w:rPr>
                 <w:rStyle w:val="Hyperlink"/>
@@ -1090,7 +1164,7 @@
                 <w:noProof/>
                 <w:webHidden/>
               </w:rPr>
-              <w:instrText xml:space="preserve"> PAGEREF _Toc227181057 \h </w:instrText>
+              <w:instrText xml:space="preserve"> PAGEREF _Toc227423386 \h </w:instrText>
             </w:r>
             <w:r>
               <w:rPr>
@@ -1110,7 +1184,7 @@
                 <w:noProof/>
                 <w:webHidden/>
               </w:rPr>
-              <w:t>4</w:t>
+              <w:t>6</w:t>
             </w:r>
             <w:r>
               <w:rPr>
@@ -1137,7 +1211,7 @@
               <w14:ligatures w14:val="standardContextual"/>
             </w:rPr>
           </w:pPr>
-          <w:hyperlink w:anchor="_Toc227181058" w:history="1">
+          <w:hyperlink w:anchor="_Toc227423387" w:history="1">
             <w:r>
               <w:rPr>
                 <w:rStyle w:val="Hyperlink"/>
@@ -1164,7 +1238,7 @@
                 <w:noProof/>
                 <w:webHidden/>
               </w:rPr>
-              <w:instrText xml:space="preserve"> PAGEREF _Toc227181058 \h </w:instrText>
+              <w:instrText xml:space="preserve"> PAGEREF _Toc227423387 \h </w:instrText>
             </w:r>
             <w:r>
               <w:rPr>
@@ -1184,7 +1258,7 @@
                 <w:noProof/>
                 <w:webHidden/>
               </w:rPr>
-              <w:t>4</w:t>
+              <w:t>6</w:t>
             </w:r>
             <w:r>
               <w:rPr>
@@ -1211,7 +1285,7 @@
               <w14:ligatures w14:val="standardContextual"/>
             </w:rPr>
           </w:pPr>
-          <w:hyperlink w:anchor="_Toc227181059" w:history="1">
+          <w:hyperlink w:anchor="_Toc227423388" w:history="1">
             <w:r>
               <w:rPr>
                 <w:rStyle w:val="Hyperlink"/>
@@ -1238,7 +1312,7 @@
                 <w:noProof/>
                 <w:webHidden/>
               </w:rPr>
-              <w:instrText xml:space="preserve"> PAGEREF _Toc227181059 \h </w:instrText>
+              <w:instrText xml:space="preserve"> PAGEREF _Toc227423388 \h </w:instrText>
             </w:r>
             <w:r>
               <w:rPr>
@@ -1258,7 +1332,7 @@
                 <w:noProof/>
                 <w:webHidden/>
               </w:rPr>
-              <w:t>4</w:t>
+              <w:t>6</w:t>
             </w:r>
             <w:r>
               <w:rPr>
@@ -1285,7 +1359,7 @@
               <w14:ligatures w14:val="standardContextual"/>
             </w:rPr>
           </w:pPr>
-          <w:hyperlink w:anchor="_Toc227181060" w:history="1">
+          <w:hyperlink w:anchor="_Toc227423389" w:history="1">
             <w:r>
               <w:rPr>
                 <w:rStyle w:val="Hyperlink"/>
@@ -1312,7 +1386,7 @@
                 <w:noProof/>
                 <w:webHidden/>
               </w:rPr>
-              <w:instrText xml:space="preserve"> PAGEREF _Toc227181060 \h </w:instrText>
+              <w:instrText xml:space="preserve"> PAGEREF _Toc227423389 \h </w:instrText>
             </w:r>
             <w:r>
               <w:rPr>
@@ -1332,7 +1406,7 @@
                 <w:noProof/>
                 <w:webHidden/>
               </w:rPr>
-              <w:t>5</w:t>
+              <w:t>7</w:t>
             </w:r>
             <w:r>
               <w:rPr>
@@ -1359,7 +1433,7 @@
               <w14:ligatures w14:val="standardContextual"/>
             </w:rPr>
           </w:pPr>
-          <w:hyperlink w:anchor="_Toc227181061" w:history="1">
+          <w:hyperlink w:anchor="_Toc227423390" w:history="1">
             <w:r>
               <w:rPr>
                 <w:rStyle w:val="Hyperlink"/>
@@ -1386,7 +1460,7 @@
                 <w:noProof/>
                 <w:webHidden/>
               </w:rPr>
-              <w:instrText xml:space="preserve"> PAGEREF _Toc227181061 \h </w:instrText>
+              <w:instrText xml:space="preserve"> PAGEREF _Toc227423390 \h </w:instrText>
             </w:r>
             <w:r>
               <w:rPr>
@@ -1406,7 +1480,7 @@
                 <w:noProof/>
                 <w:webHidden/>
               </w:rPr>
-              <w:t>5</w:t>
+              <w:t>7</w:t>
             </w:r>
             <w:r>
               <w:rPr>
@@ -1433,7 +1507,7 @@
               <w14:ligatures w14:val="standardContextual"/>
             </w:rPr>
           </w:pPr>
-          <w:hyperlink w:anchor="_Toc227181062" w:history="1">
+          <w:hyperlink w:anchor="_Toc227423391" w:history="1">
             <w:r>
               <w:rPr>
                 <w:rStyle w:val="Hyperlink"/>
@@ -1460,7 +1534,7 @@
                 <w:noProof/>
                 <w:webHidden/>
               </w:rPr>
-              <w:instrText xml:space="preserve"> PAGEREF _Toc227181062 \h </w:instrText>
+              <w:instrText xml:space="preserve"> PAGEREF _Toc227423391 \h </w:instrText>
             </w:r>
             <w:r>
               <w:rPr>
@@ -1480,7 +1554,7 @@
                 <w:noProof/>
                 <w:webHidden/>
               </w:rPr>
-              <w:t>5</w:t>
+              <w:t>7</w:t>
             </w:r>
             <w:r>
               <w:rPr>
@@ -1507,7 +1581,7 @@
               <w14:ligatures w14:val="standardContextual"/>
             </w:rPr>
           </w:pPr>
-          <w:hyperlink w:anchor="_Toc227181063" w:history="1">
+          <w:hyperlink w:anchor="_Toc227423392" w:history="1">
             <w:r>
               <w:rPr>
                 <w:rStyle w:val="Hyperlink"/>
@@ -1534,7 +1608,7 @@
                 <w:noProof/>
                 <w:webHidden/>
               </w:rPr>
-              <w:instrText xml:space="preserve"> PAGEREF _Toc227181063 \h </w:instrText>
+              <w:instrText xml:space="preserve"> PAGEREF _Toc227423392 \h </w:instrText>
             </w:r>
             <w:r>
               <w:rPr>
@@ -1554,7 +1628,7 @@
                 <w:noProof/>
                 <w:webHidden/>
               </w:rPr>
-              <w:t>5</w:t>
+              <w:t>7</w:t>
             </w:r>
             <w:r>
               <w:rPr>
@@ -1581,7 +1655,7 @@
               <w14:ligatures w14:val="standardContextual"/>
             </w:rPr>
           </w:pPr>
-          <w:hyperlink w:anchor="_Toc227181064" w:history="1">
+          <w:hyperlink w:anchor="_Toc227423393" w:history="1">
             <w:r>
               <w:rPr>
                 <w:rStyle w:val="Hyperlink"/>
@@ -1608,7 +1682,7 @@
                 <w:noProof/>
                 <w:webHidden/>
               </w:rPr>
-              <w:instrText xml:space="preserve"> PAGEREF _Toc227181064 \h </w:instrText>
+              <w:instrText xml:space="preserve"> PAGEREF _Toc227423393 \h </w:instrText>
             </w:r>
             <w:r>
               <w:rPr>
@@ -1628,7 +1702,7 @@
                 <w:noProof/>
                 <w:webHidden/>
               </w:rPr>
-              <w:t>6</w:t>
+              <w:t>7</w:t>
             </w:r>
             <w:r>
               <w:rPr>
@@ -1656,7 +1730,7 @@
               <w14:ligatures w14:val="standardContextual"/>
             </w:rPr>
           </w:pPr>
-          <w:hyperlink w:anchor="_Toc227181065" w:history="1">
+          <w:hyperlink w:anchor="_Toc227423394" w:history="1">
             <w:r>
               <w:rPr>
                 <w:rStyle w:val="Hyperlink"/>
@@ -1702,7 +1776,7 @@
                 <w:noProof/>
                 <w:webHidden/>
               </w:rPr>
-              <w:instrText xml:space="preserve"> PAGEREF _Toc227181065 \h </w:instrText>
+              <w:instrText xml:space="preserve"> PAGEREF _Toc227423394 \h </w:instrText>
             </w:r>
             <w:r>
               <w:rPr>
@@ -1722,7 +1796,7 @@
                 <w:noProof/>
                 <w:webHidden/>
               </w:rPr>
-              <w:t>6</w:t>
+              <w:t>7</w:t>
             </w:r>
             <w:r>
               <w:rPr>
@@ -1750,7 +1824,7 @@
               <w14:ligatures w14:val="standardContextual"/>
             </w:rPr>
           </w:pPr>
-          <w:hyperlink w:anchor="_Toc227181066" w:history="1">
+          <w:hyperlink w:anchor="_Toc227423395" w:history="1">
             <w:r>
               <w:rPr>
                 <w:rStyle w:val="Hyperlink"/>
@@ -1796,7 +1870,7 @@
                 <w:noProof/>
                 <w:webHidden/>
               </w:rPr>
-              <w:instrText xml:space="preserve"> PAGEREF _Toc227181066 \h </w:instrText>
+              <w:instrText xml:space="preserve"> PAGEREF _Toc227423395 \h </w:instrText>
             </w:r>
             <w:r>
               <w:rPr>
@@ -1816,7 +1890,7 @@
                 <w:noProof/>
                 <w:webHidden/>
               </w:rPr>
-              <w:t>6</w:t>
+              <w:t>8</w:t>
             </w:r>
             <w:r>
               <w:rPr>
@@ -1844,7 +1918,7 @@
               <w14:ligatures w14:val="standardContextual"/>
             </w:rPr>
           </w:pPr>
-          <w:hyperlink w:anchor="_Toc227181067" w:history="1">
+          <w:hyperlink w:anchor="_Toc227423396" w:history="1">
             <w:r>
               <w:rPr>
                 <w:rStyle w:val="Hyperlink"/>
@@ -1890,7 +1964,7 @@
                 <w:noProof/>
                 <w:webHidden/>
               </w:rPr>
-              <w:instrText xml:space="preserve"> PAGEREF _Toc227181067 \h </w:instrText>
+              <w:instrText xml:space="preserve"> PAGEREF _Toc227423396 \h </w:instrText>
             </w:r>
             <w:r>
               <w:rPr>
@@ -1910,7 +1984,7 @@
                 <w:noProof/>
                 <w:webHidden/>
               </w:rPr>
-              <w:t>7</w:t>
+              <w:t>9</w:t>
             </w:r>
             <w:r>
               <w:rPr>
@@ -1938,7 +2012,7 @@
               <w14:ligatures w14:val="standardContextual"/>
             </w:rPr>
           </w:pPr>
-          <w:hyperlink w:anchor="_Toc227181068" w:history="1">
+          <w:hyperlink w:anchor="_Toc227423397" w:history="1">
             <w:r>
               <w:rPr>
                 <w:rStyle w:val="Hyperlink"/>
@@ -1984,7 +2058,7 @@
                 <w:noProof/>
                 <w:webHidden/>
               </w:rPr>
-              <w:instrText xml:space="preserve"> PAGEREF _Toc227181068 \h </w:instrText>
+              <w:instrText xml:space="preserve"> PAGEREF _Toc227423397 \h </w:instrText>
             </w:r>
             <w:r>
               <w:rPr>
@@ -2004,7 +2078,7 @@
                 <w:noProof/>
                 <w:webHidden/>
               </w:rPr>
-              <w:t>8</w:t>
+              <w:t>10</w:t>
             </w:r>
             <w:r>
               <w:rPr>
@@ -2032,7 +2106,7 @@
               <w14:ligatures w14:val="standardContextual"/>
             </w:rPr>
           </w:pPr>
-          <w:hyperlink w:anchor="_Toc227181069" w:history="1">
+          <w:hyperlink w:anchor="_Toc227423398" w:history="1">
             <w:r>
               <w:rPr>
                 <w:rStyle w:val="Hyperlink"/>
@@ -2078,7 +2152,7 @@
                 <w:noProof/>
                 <w:webHidden/>
               </w:rPr>
-              <w:instrText xml:space="preserve"> PAGEREF _Toc227181069 \h </w:instrText>
+              <w:instrText xml:space="preserve"> PAGEREF _Toc227423398 \h </w:instrText>
             </w:r>
             <w:r>
               <w:rPr>
@@ -2098,7 +2172,7 @@
                 <w:noProof/>
                 <w:webHidden/>
               </w:rPr>
-              <w:t>8</w:t>
+              <w:t>10</w:t>
             </w:r>
             <w:r>
               <w:rPr>
@@ -2126,7 +2200,7 @@
               <w14:ligatures w14:val="standardContextual"/>
             </w:rPr>
           </w:pPr>
-          <w:hyperlink w:anchor="_Toc227181070" w:history="1">
+          <w:hyperlink w:anchor="_Toc227423399" w:history="1">
             <w:r>
               <w:rPr>
                 <w:rStyle w:val="Hyperlink"/>
@@ -2172,7 +2246,7 @@
                 <w:noProof/>
                 <w:webHidden/>
               </w:rPr>
-              <w:instrText xml:space="preserve"> PAGEREF _Toc227181070 \h </w:instrText>
+              <w:instrText xml:space="preserve"> PAGEREF _Toc227423399 \h </w:instrText>
             </w:r>
             <w:r>
               <w:rPr>
@@ -2192,7 +2266,7 @@
                 <w:noProof/>
                 <w:webHidden/>
               </w:rPr>
-              <w:t>8</w:t>
+              <w:t>10</w:t>
             </w:r>
             <w:r>
               <w:rPr>
@@ -2219,12 +2293,86 @@
               <w14:ligatures w14:val="standardContextual"/>
             </w:rPr>
           </w:pPr>
-          <w:hyperlink w:anchor="_Toc227181071" w:history="1">
+          <w:hyperlink w:anchor="_Toc227423400" w:history="1">
             <w:r>
               <w:rPr>
                 <w:rStyle w:val="Hyperlink"/>
                 <w:noProof/>
               </w:rPr>
+              <w:t>GitHub Repository</w:t>
+            </w:r>
+            <w:r>
+              <w:rPr>
+                <w:noProof/>
+                <w:webHidden/>
+              </w:rPr>
+              <w:tab/>
+            </w:r>
+            <w:r>
+              <w:rPr>
+                <w:noProof/>
+                <w:webHidden/>
+              </w:rPr>
+              <w:fldChar w:fldCharType="begin"/>
+            </w:r>
+            <w:r>
+              <w:rPr>
+                <w:noProof/>
+                <w:webHidden/>
+              </w:rPr>
+              <w:instrText xml:space="preserve"> PAGEREF _Toc227423400 \h </w:instrText>
+            </w:r>
+            <w:r>
+              <w:rPr>
+                <w:noProof/>
+                <w:webHidden/>
+              </w:rPr>
+            </w:r>
+            <w:r>
+              <w:rPr>
+                <w:noProof/>
+                <w:webHidden/>
+              </w:rPr>
+              <w:fldChar w:fldCharType="separate"/>
+            </w:r>
+            <w:r>
+              <w:rPr>
+                <w:noProof/>
+                <w:webHidden/>
+              </w:rPr>
+              <w:t>10</w:t>
+            </w:r>
+            <w:r>
+              <w:rPr>
+                <w:noProof/>
+                <w:webHidden/>
+              </w:rPr>
+              <w:fldChar w:fldCharType="end"/>
+            </w:r>
+          </w:hyperlink>
+        </w:p>
+        <w:p>
+          <w:pPr>
+            <w:pStyle w:val="TOC1"/>
+            <w:tabs>
+              <w:tab w:val="right" w:leader="dot" w:pos="9016"/>
+            </w:tabs>
+            <w:rPr>
+              <w:rFonts w:eastAsiaTheme="minorEastAsia"/>
+              <w:noProof/>
+              <w:kern w:val="2"/>
+              <w:sz w:val="24"/>
+              <w:szCs w:val="24"/>
+              <w:lang w:eastAsia="en-ZA"/>
+              <w14:ligatures w14:val="standardContextual"/>
+            </w:rPr>
+          </w:pPr>
+          <w:hyperlink w:anchor="_Toc227423401" w:history="1">
+            <w:r>
+              <w:rPr>
+                <w:rStyle w:val="Hyperlink"/>
+                <w:noProof/>
+              </w:rPr>
               <w:t>References</w:t>
             </w:r>
             <w:r>
@@ -2246,7 +2394,7 @@
                 <w:noProof/>
                 <w:webHidden/>
               </w:rPr>
-              <w:instrText xml:space="preserve"> PAGEREF _Toc227181071 \h </w:instrText>
+              <w:instrText xml:space="preserve"> PAGEREF _Toc227423401 \h </w:instrText>
             </w:r>
             <w:r>
               <w:rPr>
@@ -2266,7 +2414,7 @@
                 <w:noProof/>
                 <w:webHidden/>
               </w:rPr>
-              <w:t>9</w:t>
+              <w:t>12</w:t>
             </w:r>
             <w:r>
               <w:rPr>
@@ -2295,13 +2443,6 @@
           <w:rFonts w:ascii="Aptos" w:hAnsi="Aptos"/>
         </w:rPr>
       </w:pPr>
-    </w:p>
-    <w:p>
-      <w:pPr>
-        <w:rPr>
-          <w:rFonts w:ascii="Aptos" w:hAnsi="Aptos"/>
-        </w:rPr>
-      </w:pPr>
       <w:r>
         <w:rPr>
           <w:rFonts w:ascii="Aptos" w:hAnsi="Aptos"/>
@@ -2313,7 +2454,7 @@
       <w:pPr>
         <w:pStyle w:val="Heading1"/>
       </w:pPr>
-      <w:bookmarkStart w:id="0" w:name="_Toc227181049"/>
+      <w:bookmarkStart w:id="0" w:name="_Toc227423377"/>
       <w:r>
         <w:lastRenderedPageBreak/>
         <w:t>Organisation Overview</w:t>
@@ -2327,7 +2468,7 @@
           <w:u w:val="single"/>
         </w:rPr>
       </w:pPr>
-      <w:bookmarkStart w:id="1" w:name="_Toc227181050"/>
+      <w:bookmarkStart w:id="1" w:name="_Toc227423378"/>
       <w:r>
         <w:rPr>
           <w:u w:val="single"/>
@@ -2575,7 +2716,7 @@
           <w:u w:val="single"/>
         </w:rPr>
       </w:pPr>
-      <w:bookmarkStart w:id="2" w:name="_Toc227181051"/>
+      <w:bookmarkStart w:id="2" w:name="_Toc227423379"/>
       <w:r>
         <w:rPr>
           <w:u w:val="single"/>
@@ -2647,7 +2788,7 @@
           <w:u w:val="single"/>
         </w:rPr>
       </w:pPr>
-      <w:bookmarkStart w:id="3" w:name="_Toc227181052"/>
+      <w:bookmarkStart w:id="3" w:name="_Toc227423380"/>
       <w:r>
         <w:rPr>
           <w:u w:val="single"/>
@@ -2720,7 +2861,7 @@
           <w:u w:val="single"/>
         </w:rPr>
       </w:pPr>
-      <w:bookmarkStart w:id="4" w:name="_Toc227181053"/>
+      <w:bookmarkStart w:id="4" w:name="_Toc227423381"/>
       <w:r>
         <w:rPr>
           <w:u w:val="single"/>
@@ -2848,11 +2989,19 @@
           <w:u w:val="single"/>
         </w:rPr>
       </w:pPr>
+      <w:bookmarkStart w:id="5" w:name="_Toc227423382"/>
       <w:r>
         <w:rPr>
           <w:u w:val="single"/>
         </w:rPr>
-        <w:t>Current Website Analysis </w:t>
+        <w:t>Current Website Analysis</w:t>
+      </w:r>
+      <w:bookmarkEnd w:id="5"/>
+      <w:r>
+        <w:rPr>
+          <w:u w:val="single"/>
+        </w:rPr>
+        <w:t> </w:t>
       </w:r>
     </w:p>
     <w:p>
@@ -2896,7 +3045,7 @@
           <w:u w:val="single"/>
         </w:rPr>
       </w:pPr>
-      <w:bookmarkStart w:id="5" w:name="_Toc227181054"/>
+      <w:bookmarkStart w:id="6" w:name="_Toc227423383"/>
       <w:r>
         <w:rPr>
           <w:u w:val="single"/>
@@ -2910,7 +3059,7 @@
         </w:rPr>
         <w:t>website features and functionality</w:t>
       </w:r>
-      <w:bookmarkEnd w:id="5"/>
+      <w:bookmarkEnd w:id="6"/>
       <w:r>
         <w:rPr>
           <w:u w:val="single"/>
@@ -3047,14 +3196,14 @@
           <w:u w:val="single"/>
         </w:rPr>
       </w:pPr>
-      <w:bookmarkStart w:id="6" w:name="_Toc227181055"/>
+      <w:bookmarkStart w:id="7" w:name="_Toc227423384"/>
       <w:r>
         <w:rPr>
           <w:u w:val="single"/>
         </w:rPr>
         <w:t>Design and User Experience</w:t>
       </w:r>
-      <w:bookmarkEnd w:id="6"/>
+      <w:bookmarkEnd w:id="7"/>
     </w:p>
     <w:p>
       <w:pPr>
@@ -3063,14 +3212,14 @@
           <w:u w:val="single"/>
         </w:rPr>
       </w:pPr>
-      <w:bookmarkStart w:id="7" w:name="_Toc227181056"/>
+      <w:bookmarkStart w:id="8" w:name="_Toc227423385"/>
       <w:r>
         <w:rPr>
           <w:u w:val="single"/>
         </w:rPr>
         <w:t>Colour scheme</w:t>
       </w:r>
-      <w:bookmarkEnd w:id="7"/>
+      <w:bookmarkEnd w:id="8"/>
     </w:p>
     <w:p>
       <w:r>
@@ -3275,14 +3424,14 @@
           <w:u w:val="single"/>
         </w:rPr>
       </w:pPr>
-      <w:bookmarkStart w:id="8" w:name="_Toc227181057"/>
+      <w:bookmarkStart w:id="9" w:name="_Toc227423386"/>
       <w:r>
         <w:rPr>
           <w:u w:val="single"/>
         </w:rPr>
         <w:t>Typography</w:t>
       </w:r>
-      <w:bookmarkEnd w:id="8"/>
+      <w:bookmarkEnd w:id="9"/>
     </w:p>
     <w:p>
       <w:r>
@@ -3827,7 +3976,7 @@
           <w:u w:val="single"/>
         </w:rPr>
       </w:pPr>
-      <w:bookmarkStart w:id="9" w:name="_Toc227181058"/>
+      <w:bookmarkStart w:id="10" w:name="_Toc227423387"/>
       <w:r>
         <w:rPr>
           <w:u w:val="single"/>
@@ -3840,7 +3989,7 @@
         </w:rPr>
         <w:t xml:space="preserve"> Requirements</w:t>
       </w:r>
-      <w:bookmarkEnd w:id="9"/>
+      <w:bookmarkEnd w:id="10"/>
     </w:p>
     <w:p>
       <w:r>
@@ -3854,7 +4003,7 @@
           <w:u w:val="single"/>
         </w:rPr>
       </w:pPr>
-      <w:bookmarkStart w:id="10" w:name="_Toc227181059"/>
+      <w:bookmarkStart w:id="11" w:name="_Toc227423388"/>
       <w:r>
         <w:rPr>
           <w:u w:val="single"/>
@@ -3867,7 +4016,7 @@
         </w:rPr>
         <w:t>s</w:t>
       </w:r>
-      <w:bookmarkEnd w:id="10"/>
+      <w:bookmarkEnd w:id="11"/>
     </w:p>
     <w:p>
       <w:r>
@@ -3910,7 +4059,7 @@
           <w:u w:val="single"/>
         </w:rPr>
       </w:pPr>
-      <w:bookmarkStart w:id="11" w:name="_Toc227181060"/>
+      <w:bookmarkStart w:id="12" w:name="_Toc227423389"/>
       <w:r>
         <w:rPr>
           <w:u w:val="single"/>
@@ -3918,7 +4067,7 @@
         <w:lastRenderedPageBreak/>
         <w:t>Budget</w:t>
       </w:r>
-      <w:bookmarkEnd w:id="11"/>
+      <w:bookmarkEnd w:id="12"/>
     </w:p>
     <w:p>
       <w:r>
@@ -3998,14 +4147,14 @@
           <w:u w:val="single"/>
         </w:rPr>
       </w:pPr>
-      <w:bookmarkStart w:id="12" w:name="_Toc227181061"/>
+      <w:bookmarkStart w:id="13" w:name="_Toc227423390"/>
       <w:r>
         <w:rPr>
           <w:u w:val="single"/>
         </w:rPr>
         <w:t>Content Research and sourcing</w:t>
       </w:r>
-      <w:bookmarkEnd w:id="12"/>
+      <w:bookmarkEnd w:id="13"/>
     </w:p>
     <w:p>
       <w:r>
@@ -4040,14 +4189,14 @@
           <w:u w:val="single"/>
         </w:rPr>
       </w:pPr>
-      <w:bookmarkStart w:id="13" w:name="_Toc227181062"/>
+      <w:bookmarkStart w:id="14" w:name="_Toc227423391"/>
       <w:r>
         <w:rPr>
           <w:u w:val="single"/>
         </w:rPr>
         <w:t>Website Structure and Planning</w:t>
       </w:r>
-      <w:bookmarkEnd w:id="13"/>
+      <w:bookmarkEnd w:id="14"/>
     </w:p>
     <w:p>
       <w:pPr>
@@ -4056,7 +4205,7 @@
           <w:u w:val="single"/>
         </w:rPr>
       </w:pPr>
-      <w:bookmarkStart w:id="14" w:name="_Toc227181063"/>
+      <w:bookmarkStart w:id="15" w:name="_Toc227423392"/>
       <w:r>
         <w:rPr>
           <w:u w:val="single"/>
@@ -4069,7 +4218,7 @@
         </w:rPr>
         <w:t>p</w:t>
       </w:r>
-      <w:bookmarkEnd w:id="14"/>
+      <w:bookmarkEnd w:id="15"/>
     </w:p>
     <w:p>
       <w:r>
@@ -4098,7 +4247,7 @@
           <w:u w:val="single"/>
         </w:rPr>
       </w:pPr>
-      <w:bookmarkStart w:id="15" w:name="_Toc227181064"/>
+      <w:bookmarkStart w:id="16" w:name="_Toc227423393"/>
       <w:r>
         <w:rPr>
           <w:u w:val="single"/>
@@ -4117,7 +4266,7 @@
         </w:rPr>
         <w:t xml:space="preserve"> - contents</w:t>
       </w:r>
-      <w:bookmarkEnd w:id="15"/>
+      <w:bookmarkEnd w:id="16"/>
     </w:p>
     <w:p>
       <w:pPr>
@@ -4127,11 +4276,11 @@
           <w:numId w:val="6"/>
         </w:numPr>
       </w:pPr>
-      <w:bookmarkStart w:id="16" w:name="_Toc227181065"/>
+      <w:bookmarkStart w:id="17" w:name="_Toc227423394"/>
       <w:r>
         <w:t>Homepage</w:t>
       </w:r>
-      <w:bookmarkEnd w:id="16"/>
+      <w:bookmarkEnd w:id="17"/>
     </w:p>
     <w:p>
       <w:r>
@@ -4160,12 +4309,12 @@
           <w:numId w:val="6"/>
         </w:numPr>
       </w:pPr>
-      <w:bookmarkStart w:id="17" w:name="_Toc227181066"/>
+      <w:bookmarkStart w:id="18" w:name="_Toc227423395"/>
       <w:r>
         <w:lastRenderedPageBreak/>
         <w:t>About us</w:t>
       </w:r>
-      <w:bookmarkEnd w:id="17"/>
+      <w:bookmarkEnd w:id="18"/>
     </w:p>
     <w:p>
       <w:r>
@@ -4260,7 +4409,7 @@
           <w:noProof/>
         </w:rPr>
         <w:drawing>
-          <wp:inline distT="0" distB="0" distL="0" distR="0" wp14:anchorId="307F73B5" wp14:editId="221F49EE">
+          <wp:inline distT="0" distB="0" distL="0" distR="0" wp14:anchorId="307F73B5" wp14:editId="46A1FEC9">
             <wp:extent cx="2174631" cy="2898625"/>
             <wp:effectExtent l="0" t="0" r="0" b="0"/>
             <wp:docPr id="1250077968" name="Picture 11"/>
@@ -4414,11 +4563,11 @@
           <w:numId w:val="6"/>
         </w:numPr>
       </w:pPr>
-      <w:bookmarkStart w:id="18" w:name="_Toc227181067"/>
+      <w:bookmarkStart w:id="19" w:name="_Toc227423396"/>
       <w:r>
         <w:t>Directory</w:t>
       </w:r>
-      <w:bookmarkEnd w:id="18"/>
+      <w:bookmarkEnd w:id="19"/>
     </w:p>
     <w:p>
       <w:r>
@@ -4440,7 +4589,7 @@
           <w:noProof/>
         </w:rPr>
         <w:drawing>
-          <wp:inline distT="0" distB="0" distL="0" distR="0" wp14:anchorId="786C52CC" wp14:editId="0CC9506E">
+          <wp:inline distT="0" distB="0" distL="0" distR="0" wp14:anchorId="786C52CC" wp14:editId="7795BDDF">
             <wp:extent cx="2276475" cy="1517566"/>
             <wp:effectExtent l="0" t="0" r="0" b="6985"/>
             <wp:docPr id="1989201762" name="Picture 11"/>
@@ -4720,11 +4869,11 @@
           <w:numId w:val="6"/>
         </w:numPr>
       </w:pPr>
-      <w:bookmarkStart w:id="19" w:name="_Toc227181068"/>
+      <w:bookmarkStart w:id="20" w:name="_Toc227423397"/>
       <w:r>
         <w:t>Photo gallery</w:t>
       </w:r>
-      <w:bookmarkEnd w:id="19"/>
+      <w:bookmarkEnd w:id="20"/>
     </w:p>
     <w:p>
       <w:r>
@@ -4757,11 +4906,11 @@
           <w:numId w:val="6"/>
         </w:numPr>
       </w:pPr>
-      <w:bookmarkStart w:id="20" w:name="_Toc227181069"/>
+      <w:bookmarkStart w:id="21" w:name="_Toc227423398"/>
       <w:r>
         <w:t>Devotions</w:t>
       </w:r>
-      <w:bookmarkEnd w:id="20"/>
+      <w:bookmarkEnd w:id="21"/>
     </w:p>
     <w:p>
       <w:r>
@@ -4776,11 +4925,11 @@
           <w:numId w:val="6"/>
         </w:numPr>
       </w:pPr>
-      <w:bookmarkStart w:id="21" w:name="_Toc227181070"/>
+      <w:bookmarkStart w:id="22" w:name="_Toc227423399"/>
       <w:r>
         <w:t>Contact Us</w:t>
       </w:r>
-      <w:bookmarkEnd w:id="21"/>
+      <w:bookmarkEnd w:id="22"/>
     </w:p>
     <w:p>
       <w:r>
@@ -4788,21 +4937,6 @@
       </w:r>
       <w:r>
         <w:t>rmation such as an email address, contact number and address</w:t>
-      </w:r>
-    </w:p>
-    <w:p>
-      <w:pPr>
-        <w:pStyle w:val="Heading3"/>
-      </w:pPr>
-    </w:p>
-    <w:p/>
-    <w:p/>
-    <w:p/>
-    <w:p/>
-    <w:p/>
-    <w:p>
-      <w:r>
-        <w:br w:type="page"/>
       </w:r>
     </w:p>
     <w:p>
@@ -4812,7 +4946,30 @@
           <w:u w:val="single"/>
         </w:rPr>
       </w:pPr>
-      <w:bookmarkStart w:id="22" w:name="_Toc227181071"/>
+      <w:bookmarkStart w:id="23" w:name="_Toc227423400"/>
+      <w:r>
+        <w:rPr>
+          <w:u w:val="single"/>
+        </w:rPr>
+        <w:t>GitHub Repository</w:t>
+      </w:r>
+      <w:bookmarkEnd w:id="23"/>
+    </w:p>
+    <w:p>
+      <w:r>
+        <w:t xml:space="preserve"> </w:t>
+      </w:r>
+    </w:p>
+    <w:p/>
+    <w:p/>
+    <w:p>
+      <w:pPr>
+        <w:pStyle w:val="Heading1"/>
+        <w:rPr>
+          <w:u w:val="single"/>
+        </w:rPr>
+      </w:pPr>
+      <w:bookmarkStart w:id="24" w:name="_Toc227423401"/>
       <w:r>
         <w:rPr>
           <w:u w:val="single"/>
@@ -4820,7 +4977,7 @@
         <w:lastRenderedPageBreak/>
         <w:t>References</w:t>
       </w:r>
-      <w:bookmarkEnd w:id="22"/>
+      <w:bookmarkEnd w:id="24"/>
     </w:p>
     <w:p>
       <w:r>
@@ -6881,6 +7038,7 @@
   <w:style w:type="character" w:default="1" w:styleId="DefaultParagraphFont">
     <w:name w:val="Default Paragraph Font"/>
     <w:uiPriority w:val="1"/>
+    <w:semiHidden/>
     <w:unhideWhenUsed/>
   </w:style>
   <w:style w:type="table" w:default="1" w:styleId="TableNormal">
@@ -12619,6 +12777,7 @@
     <w:rsid w:val="00487BA5"/>
     <w:rsid w:val="004D746C"/>
     <w:rsid w:val="004F2BF5"/>
+    <w:rsid w:val="0072716C"/>
     <w:rsid w:val="0091224C"/>
     <w:rsid w:val="0095784B"/>
     <w:rsid w:val="0097210F"/>
@@ -12627,6 +12786,7 @@
     <w:rsid w:val="00AC01F9"/>
     <w:rsid w:val="00B008E0"/>
     <w:rsid w:val="00C45BC0"/>
+    <w:rsid w:val="00CB7A2A"/>
     <w:rsid w:val="00D969B2"/>
     <w:rsid w:val="00EC5379"/>
   </w:rsids>
@@ -13389,6 +13549,12 @@
 </file>
 
 <file path=customXml/item1.xml><?xml version="1.0" encoding="utf-8"?>
+<p:properties xmlns:p="http://schemas.microsoft.com/office/2006/metadata/properties" xmlns:xsi="http://www.w3.org/2001/XMLSchema-instance" xmlns:pc="http://schemas.microsoft.com/office/infopath/2007/PartnerControls">
+  <documentManagement/>
+</p:properties>
+</file>
+
+<file path=customXml/item2.xml><?xml version="1.0" encoding="utf-8"?>
 <?mso-contentType ?>
 <FormTemplates xmlns="http://schemas.microsoft.com/sharepoint/v3/contenttype/forms">
   <Display>DocumentLibraryForm</Display>
@@ -13397,17 +13563,7 @@
 </FormTemplates>
 </file>
 
-<file path=customXml/item2.xml><?xml version="1.0" encoding="utf-8"?>
-<p:properties xmlns:p="http://schemas.microsoft.com/office/2006/metadata/properties" xmlns:xsi="http://www.w3.org/2001/XMLSchema-instance" xmlns:pc="http://schemas.microsoft.com/office/infopath/2007/PartnerControls">
-  <documentManagement/>
-</p:properties>
-</file>
-
 <file path=customXml/item3.xml><?xml version="1.0" encoding="utf-8"?>
-<b:Sources xmlns:b="http://schemas.openxmlformats.org/officeDocument/2006/bibliography" xmlns="http://schemas.openxmlformats.org/officeDocument/2006/bibliography" SelectedStyle="\APASixthEditionOfficeOnline.xsl" StyleName="APA" Version="6"/>
-</file>
-
-<file path=customXml/item4.xml><?xml version="1.0" encoding="utf-8"?>
 <ct:contentTypeSchema xmlns:ct="http://schemas.microsoft.com/office/2006/metadata/contentType" xmlns:ma="http://schemas.microsoft.com/office/2006/metadata/properties/metaAttributes" ct:_="" ma:_="" ma:contentTypeName="Document" ma:contentTypeID="0x010100B2EDC9862BBAAA44B730DBD4404490AA" ma:contentTypeVersion="4" ma:contentTypeDescription="Create a new document." ma:contentTypeScope="" ma:versionID="50bb7ee3313c9b11ca84bed7ede64bbd">
   <xsd:schema xmlns:xsd="http://www.w3.org/2001/XMLSchema" xmlns:xs="http://www.w3.org/2001/XMLSchema" xmlns:p="http://schemas.microsoft.com/office/2006/metadata/properties" xmlns:ns3="e37b7e94-9825-4227-9fd6-384ec836ded2" targetNamespace="http://schemas.microsoft.com/office/2006/metadata/properties" ma:root="true" ma:fieldsID="f11e42b959fbe85a93bbedebedb7cb3a" ns3:_="">
     <xsd:import namespace="e37b7e94-9825-4227-9fd6-384ec836ded2"/>
@@ -13551,15 +13707,11 @@
 </ct:contentTypeSchema>
 </file>
 
-<file path=customXml/itemProps1.xml><?xml version="1.0" encoding="utf-8"?>
-<ds:datastoreItem xmlns:ds="http://schemas.openxmlformats.org/officeDocument/2006/customXml" ds:itemID="{CF003951-7E75-4ED4-BFA3-CDBE00B72EE7}">
-  <ds:schemaRefs>
-    <ds:schemaRef ds:uri="http://schemas.microsoft.com/sharepoint/v3/contenttype/forms"/>
-  </ds:schemaRefs>
-</ds:datastoreItem>
+<file path=customXml/item4.xml><?xml version="1.0" encoding="utf-8"?>
+<b:Sources xmlns:b="http://schemas.openxmlformats.org/officeDocument/2006/bibliography" xmlns="http://schemas.openxmlformats.org/officeDocument/2006/bibliography" SelectedStyle="\APASixthEditionOfficeOnline.xsl" StyleName="APA" Version="6"/>
 </file>
 
-<file path=customXml/itemProps2.xml><?xml version="1.0" encoding="utf-8"?>
+<file path=customXml/itemProps1.xml><?xml version="1.0" encoding="utf-8"?>
 <ds:datastoreItem xmlns:ds="http://schemas.openxmlformats.org/officeDocument/2006/customXml" ds:itemID="{F62A69DE-8026-47D3-9AD3-F604AD3B930F}">
   <ds:schemaRefs>
     <ds:schemaRef ds:uri="http://schemas.microsoft.com/office/2006/metadata/properties"/>
@@ -13568,15 +13720,15 @@
 </ds:datastoreItem>
 </file>
 
-<file path=customXml/itemProps3.xml><?xml version="1.0" encoding="utf-8"?>
-<ds:datastoreItem xmlns:ds="http://schemas.openxmlformats.org/officeDocument/2006/customXml" ds:itemID="{501800D9-3A9A-4D24-AC96-B1CAD3E43EAD}">
+<file path=customXml/itemProps2.xml><?xml version="1.0" encoding="utf-8"?>
+<ds:datastoreItem xmlns:ds="http://schemas.openxmlformats.org/officeDocument/2006/customXml" ds:itemID="{CF003951-7E75-4ED4-BFA3-CDBE00B72EE7}">
   <ds:schemaRefs>
-    <ds:schemaRef ds:uri="http://schemas.openxmlformats.org/officeDocument/2006/bibliography"/>
+    <ds:schemaRef ds:uri="http://schemas.microsoft.com/sharepoint/v3/contenttype/forms"/>
   </ds:schemaRefs>
 </ds:datastoreItem>
 </file>
 
-<file path=customXml/itemProps4.xml><?xml version="1.0" encoding="utf-8"?>
+<file path=customXml/itemProps3.xml><?xml version="1.0" encoding="utf-8"?>
 <ds:datastoreItem xmlns:ds="http://schemas.openxmlformats.org/officeDocument/2006/customXml" ds:itemID="{D884DCF3-AD66-4A9A-9E45-E0C0FDDEC1FE}">
   <ds:schemaRefs>
     <ds:schemaRef ds:uri="http://schemas.microsoft.com/office/2006/metadata/contentType"/>
@@ -13594,6 +13746,14 @@
 </ds:datastoreItem>
 </file>
 
+<file path=customXml/itemProps4.xml><?xml version="1.0" encoding="utf-8"?>
+<ds:datastoreItem xmlns:ds="http://schemas.openxmlformats.org/officeDocument/2006/customXml" ds:itemID="{501800D9-3A9A-4D24-AC96-B1CAD3E43EAD}">
+  <ds:schemaRefs>
+    <ds:schemaRef ds:uri="http://schemas.openxmlformats.org/officeDocument/2006/bibliography"/>
+  </ds:schemaRefs>
+</ds:datastoreItem>
+</file>
+
 <file path=docMetadata/LabelInfo.xml><?xml version="1.0" encoding="utf-8"?>
 <clbl:labelList xmlns:clbl="http://schemas.microsoft.com/office/2020/mipLabelMetadata">
   <clbl:label id="{e10c8f44-f469-448f-bc0d-d781288ff01b}" enabled="0" method="" siteId="{e10c8f44-f469-448f-bc0d-d781288ff01b}" removed="1"/>

</xml_diff>

<commit_message>
Editing Proposal doc and change to pdf file
</commit_message>
<xml_diff>
--- a/Documents/Zionist Churches Proposal.docx
+++ b/Documents/Zionist Churches Proposal.docx
@@ -27,6 +27,7 @@
             <w:spacing w:before="1540" w:after="240"/>
             <w:rPr>
               <w:color w:val="5B9BD5" w:themeColor="accent1"/>
+              <w:lang w:val="en-ZA"/>
             </w:rPr>
           </w:pPr>
         </w:p>
@@ -38,6 +39,7 @@
               <w:color w:val="5B9BD5" w:themeColor="accent1"/>
               <w:sz w:val="72"/>
               <w:szCs w:val="72"/>
+              <w:lang w:val="en-ZA"/>
             </w:rPr>
             <w:alias w:val="Title"/>
             <w:tag w:val=""/>
@@ -70,6 +72,7 @@
                   <w:color w:val="5B9BD5" w:themeColor="accent1"/>
                   <w:sz w:val="80"/>
                   <w:szCs w:val="80"/>
+                  <w:lang w:val="en-ZA"/>
                 </w:rPr>
               </w:pPr>
               <w:r>
@@ -79,6 +82,7 @@
                   <w:color w:val="5B9BD5" w:themeColor="accent1"/>
                   <w:sz w:val="72"/>
                   <w:szCs w:val="72"/>
+                  <w:lang w:val="en-ZA"/>
                 </w:rPr>
                 <w:t xml:space="preserve">Proposal for </w:t>
               </w:r>
@@ -89,6 +93,7 @@
                   <w:color w:val="5B9BD5" w:themeColor="accent1"/>
                   <w:sz w:val="72"/>
                   <w:szCs w:val="72"/>
+                  <w:lang w:val="en-ZA"/>
                 </w:rPr>
                 <w:t>Zionist church (NPO)</w:t>
               </w:r>
@@ -103,6 +108,7 @@
               <w:color w:val="5B9BD5" w:themeColor="accent1"/>
               <w:sz w:val="28"/>
               <w:szCs w:val="28"/>
+              <w:lang w:val="en-ZA"/>
             </w:rPr>
           </w:pPr>
         </w:p>
@@ -113,14 +119,15 @@
             <w:jc w:val="center"/>
             <w:rPr>
               <w:color w:val="5B9BD5" w:themeColor="accent1"/>
+              <w:lang w:val="en-ZA"/>
             </w:rPr>
           </w:pPr>
           <w:r>
             <w:rPr>
-              <w:noProof/>
               <w:color w:val="5B9BD5" w:themeColor="accent1"/>
               <w:sz w:val="28"/>
               <w:szCs w:val="28"/>
+              <w:lang w:val="en-ZA"/>
             </w:rPr>
             <mc:AlternateContent>
               <mc:Choice Requires="wps">
@@ -356,9 +363,6 @@
         </w:p>
         <w:p>
           <w:r>
-            <w:rPr>
-              <w:noProof/>
-            </w:rPr>
             <w:drawing>
               <wp:anchor distT="0" distB="0" distL="114300" distR="114300" simplePos="0" relativeHeight="251674624" behindDoc="1" locked="0" layoutInCell="1" allowOverlap="1" wp14:anchorId="5321C080" wp14:editId="17782FE5">
                 <wp:simplePos x="0" y="0"/>
@@ -434,15 +438,20 @@
         <w:rPr>
           <w:b/>
           <w:bCs/>
-          <w:noProof/>
         </w:rPr>
       </w:sdtEndPr>
       <w:sdtContent>
         <w:p>
           <w:pPr>
             <w:pStyle w:val="TOCHeading"/>
+            <w:rPr>
+              <w:lang w:val="en-ZA"/>
+            </w:rPr>
           </w:pPr>
           <w:r>
+            <w:rPr>
+              <w:lang w:val="en-ZA"/>
+            </w:rPr>
             <w:t>Contents</w:t>
           </w:r>
         </w:p>
@@ -454,7 +463,6 @@
             </w:tabs>
             <w:rPr>
               <w:rFonts w:eastAsiaTheme="minorEastAsia"/>
-              <w:noProof/>
               <w:kern w:val="2"/>
               <w:sz w:val="24"/>
               <w:szCs w:val="24"/>
@@ -471,58 +479,50 @@
           <w:r>
             <w:fldChar w:fldCharType="separate"/>
           </w:r>
-          <w:hyperlink w:anchor="_Toc227423377" w:history="1">
+          <w:hyperlink w:anchor="_Toc227491224" w:history="1">
             <w:r>
               <w:rPr>
                 <w:rStyle w:val="Hyperlink"/>
-                <w:noProof/>
               </w:rPr>
               <w:t>Organisation Overview</w:t>
             </w:r>
             <w:r>
               <w:rPr>
-                <w:noProof/>
                 <w:webHidden/>
               </w:rPr>
               <w:tab/>
             </w:r>
             <w:r>
               <w:rPr>
-                <w:noProof/>
                 <w:webHidden/>
               </w:rPr>
               <w:fldChar w:fldCharType="begin"/>
             </w:r>
             <w:r>
               <w:rPr>
-                <w:noProof/>
-                <w:webHidden/>
-              </w:rPr>
-              <w:instrText xml:space="preserve"> PAGEREF _Toc227423377 \h </w:instrText>
-            </w:r>
-            <w:r>
-              <w:rPr>
-                <w:noProof/>
-                <w:webHidden/>
-              </w:rPr>
-            </w:r>
-            <w:r>
-              <w:rPr>
-                <w:noProof/>
+                <w:webHidden/>
+              </w:rPr>
+              <w:instrText xml:space="preserve"> PAGEREF _Toc227491224 \h </w:instrText>
+            </w:r>
+            <w:r>
+              <w:rPr>
+                <w:webHidden/>
+              </w:rPr>
+            </w:r>
+            <w:r>
+              <w:rPr>
                 <w:webHidden/>
               </w:rPr>
               <w:fldChar w:fldCharType="separate"/>
             </w:r>
             <w:r>
               <w:rPr>
-                <w:noProof/>
-                <w:webHidden/>
-              </w:rPr>
-              <w:t>3</w:t>
-            </w:r>
-            <w:r>
-              <w:rPr>
-                <w:noProof/>
+                <w:webHidden/>
+              </w:rPr>
+              <w:t>2</w:t>
+            </w:r>
+            <w:r>
+              <w:rPr>
                 <w:webHidden/>
               </w:rPr>
               <w:fldChar w:fldCharType="end"/>
@@ -537,7 +537,6 @@
             </w:tabs>
             <w:rPr>
               <w:rFonts w:eastAsiaTheme="minorEastAsia"/>
-              <w:noProof/>
               <w:kern w:val="2"/>
               <w:sz w:val="24"/>
               <w:szCs w:val="24"/>
@@ -545,58 +544,50 @@
               <w14:ligatures w14:val="standardContextual"/>
             </w:rPr>
           </w:pPr>
-          <w:hyperlink w:anchor="_Toc227423378" w:history="1">
+          <w:hyperlink w:anchor="_Toc227491225" w:history="1">
             <w:r>
               <w:rPr>
                 <w:rStyle w:val="Hyperlink"/>
-                <w:noProof/>
               </w:rPr>
               <w:t>Zionist Churches – Brief summary</w:t>
             </w:r>
             <w:r>
               <w:rPr>
-                <w:noProof/>
                 <w:webHidden/>
               </w:rPr>
               <w:tab/>
             </w:r>
             <w:r>
               <w:rPr>
-                <w:noProof/>
                 <w:webHidden/>
               </w:rPr>
               <w:fldChar w:fldCharType="begin"/>
             </w:r>
             <w:r>
               <w:rPr>
-                <w:noProof/>
-                <w:webHidden/>
-              </w:rPr>
-              <w:instrText xml:space="preserve"> PAGEREF _Toc227423378 \h </w:instrText>
-            </w:r>
-            <w:r>
-              <w:rPr>
-                <w:noProof/>
-                <w:webHidden/>
-              </w:rPr>
-            </w:r>
-            <w:r>
-              <w:rPr>
-                <w:noProof/>
+                <w:webHidden/>
+              </w:rPr>
+              <w:instrText xml:space="preserve"> PAGEREF _Toc227491225 \h </w:instrText>
+            </w:r>
+            <w:r>
+              <w:rPr>
+                <w:webHidden/>
+              </w:rPr>
+            </w:r>
+            <w:r>
+              <w:rPr>
                 <w:webHidden/>
               </w:rPr>
               <w:fldChar w:fldCharType="separate"/>
             </w:r>
             <w:r>
               <w:rPr>
-                <w:noProof/>
-                <w:webHidden/>
-              </w:rPr>
-              <w:t>3</w:t>
-            </w:r>
-            <w:r>
-              <w:rPr>
-                <w:noProof/>
+                <w:webHidden/>
+              </w:rPr>
+              <w:t>2</w:t>
+            </w:r>
+            <w:r>
+              <w:rPr>
                 <w:webHidden/>
               </w:rPr>
               <w:fldChar w:fldCharType="end"/>
@@ -611,7 +602,6 @@
             </w:tabs>
             <w:rPr>
               <w:rFonts w:eastAsiaTheme="minorEastAsia"/>
-              <w:noProof/>
               <w:kern w:val="2"/>
               <w:sz w:val="24"/>
               <w:szCs w:val="24"/>
@@ -619,58 +609,50 @@
               <w14:ligatures w14:val="standardContextual"/>
             </w:rPr>
           </w:pPr>
-          <w:hyperlink w:anchor="_Toc227423379" w:history="1">
+          <w:hyperlink w:anchor="_Toc227491226" w:history="1">
             <w:r>
               <w:rPr>
                 <w:rStyle w:val="Hyperlink"/>
-                <w:noProof/>
               </w:rPr>
               <w:t>Mission and Vision</w:t>
             </w:r>
             <w:r>
               <w:rPr>
-                <w:noProof/>
                 <w:webHidden/>
               </w:rPr>
               <w:tab/>
             </w:r>
             <w:r>
               <w:rPr>
-                <w:noProof/>
                 <w:webHidden/>
               </w:rPr>
               <w:fldChar w:fldCharType="begin"/>
             </w:r>
             <w:r>
               <w:rPr>
-                <w:noProof/>
-                <w:webHidden/>
-              </w:rPr>
-              <w:instrText xml:space="preserve"> PAGEREF _Toc227423379 \h </w:instrText>
-            </w:r>
-            <w:r>
-              <w:rPr>
-                <w:noProof/>
-                <w:webHidden/>
-              </w:rPr>
-            </w:r>
-            <w:r>
-              <w:rPr>
-                <w:noProof/>
+                <w:webHidden/>
+              </w:rPr>
+              <w:instrText xml:space="preserve"> PAGEREF _Toc227491226 \h </w:instrText>
+            </w:r>
+            <w:r>
+              <w:rPr>
+                <w:webHidden/>
+              </w:rPr>
+            </w:r>
+            <w:r>
+              <w:rPr>
                 <w:webHidden/>
               </w:rPr>
               <w:fldChar w:fldCharType="separate"/>
             </w:r>
             <w:r>
               <w:rPr>
-                <w:noProof/>
-                <w:webHidden/>
-              </w:rPr>
-              <w:t>3</w:t>
-            </w:r>
-            <w:r>
-              <w:rPr>
-                <w:noProof/>
+                <w:webHidden/>
+              </w:rPr>
+              <w:t>2</w:t>
+            </w:r>
+            <w:r>
+              <w:rPr>
                 <w:webHidden/>
               </w:rPr>
               <w:fldChar w:fldCharType="end"/>
@@ -685,7 +667,6 @@
             </w:tabs>
             <w:rPr>
               <w:rFonts w:eastAsiaTheme="minorEastAsia"/>
-              <w:noProof/>
               <w:kern w:val="2"/>
               <w:sz w:val="24"/>
               <w:szCs w:val="24"/>
@@ -693,58 +674,50 @@
               <w14:ligatures w14:val="standardContextual"/>
             </w:rPr>
           </w:pPr>
-          <w:hyperlink w:anchor="_Toc227423380" w:history="1">
+          <w:hyperlink w:anchor="_Toc227491227" w:history="1">
             <w:r>
               <w:rPr>
                 <w:rStyle w:val="Hyperlink"/>
-                <w:noProof/>
               </w:rPr>
               <w:t>Target audience</w:t>
             </w:r>
             <w:r>
               <w:rPr>
-                <w:noProof/>
                 <w:webHidden/>
               </w:rPr>
               <w:tab/>
             </w:r>
             <w:r>
               <w:rPr>
-                <w:noProof/>
                 <w:webHidden/>
               </w:rPr>
               <w:fldChar w:fldCharType="begin"/>
             </w:r>
             <w:r>
               <w:rPr>
-                <w:noProof/>
-                <w:webHidden/>
-              </w:rPr>
-              <w:instrText xml:space="preserve"> PAGEREF _Toc227423380 \h </w:instrText>
-            </w:r>
-            <w:r>
-              <w:rPr>
-                <w:noProof/>
-                <w:webHidden/>
-              </w:rPr>
-            </w:r>
-            <w:r>
-              <w:rPr>
-                <w:noProof/>
+                <w:webHidden/>
+              </w:rPr>
+              <w:instrText xml:space="preserve"> PAGEREF _Toc227491227 \h </w:instrText>
+            </w:r>
+            <w:r>
+              <w:rPr>
+                <w:webHidden/>
+              </w:rPr>
+            </w:r>
+            <w:r>
+              <w:rPr>
                 <w:webHidden/>
               </w:rPr>
               <w:fldChar w:fldCharType="separate"/>
             </w:r>
             <w:r>
               <w:rPr>
-                <w:noProof/>
-                <w:webHidden/>
-              </w:rPr>
-              <w:t>4</w:t>
-            </w:r>
-            <w:r>
-              <w:rPr>
-                <w:noProof/>
+                <w:webHidden/>
+              </w:rPr>
+              <w:t>3</w:t>
+            </w:r>
+            <w:r>
+              <w:rPr>
                 <w:webHidden/>
               </w:rPr>
               <w:fldChar w:fldCharType="end"/>
@@ -759,7 +732,6 @@
             </w:tabs>
             <w:rPr>
               <w:rFonts w:eastAsiaTheme="minorEastAsia"/>
-              <w:noProof/>
               <w:kern w:val="2"/>
               <w:sz w:val="24"/>
               <w:szCs w:val="24"/>
@@ -767,58 +739,50 @@
               <w14:ligatures w14:val="standardContextual"/>
             </w:rPr>
           </w:pPr>
-          <w:hyperlink w:anchor="_Toc227423381" w:history="1">
+          <w:hyperlink w:anchor="_Toc227491228" w:history="1">
             <w:r>
               <w:rPr>
                 <w:rStyle w:val="Hyperlink"/>
-                <w:noProof/>
               </w:rPr>
               <w:t>Website Goals and Objectives</w:t>
             </w:r>
             <w:r>
               <w:rPr>
-                <w:noProof/>
                 <w:webHidden/>
               </w:rPr>
               <w:tab/>
             </w:r>
             <w:r>
               <w:rPr>
-                <w:noProof/>
                 <w:webHidden/>
               </w:rPr>
               <w:fldChar w:fldCharType="begin"/>
             </w:r>
             <w:r>
               <w:rPr>
-                <w:noProof/>
-                <w:webHidden/>
-              </w:rPr>
-              <w:instrText xml:space="preserve"> PAGEREF _Toc227423381 \h </w:instrText>
-            </w:r>
-            <w:r>
-              <w:rPr>
-                <w:noProof/>
-                <w:webHidden/>
-              </w:rPr>
-            </w:r>
-            <w:r>
-              <w:rPr>
-                <w:noProof/>
+                <w:webHidden/>
+              </w:rPr>
+              <w:instrText xml:space="preserve"> PAGEREF _Toc227491228 \h </w:instrText>
+            </w:r>
+            <w:r>
+              <w:rPr>
+                <w:webHidden/>
+              </w:rPr>
+            </w:r>
+            <w:r>
+              <w:rPr>
                 <w:webHidden/>
               </w:rPr>
               <w:fldChar w:fldCharType="separate"/>
             </w:r>
             <w:r>
               <w:rPr>
-                <w:noProof/>
-                <w:webHidden/>
-              </w:rPr>
-              <w:t>4</w:t>
-            </w:r>
-            <w:r>
-              <w:rPr>
-                <w:noProof/>
+                <w:webHidden/>
+              </w:rPr>
+              <w:t>3</w:t>
+            </w:r>
+            <w:r>
+              <w:rPr>
                 <w:webHidden/>
               </w:rPr>
               <w:fldChar w:fldCharType="end"/>
@@ -833,7 +797,6 @@
             </w:tabs>
             <w:rPr>
               <w:rFonts w:eastAsiaTheme="minorEastAsia"/>
-              <w:noProof/>
               <w:kern w:val="2"/>
               <w:sz w:val="24"/>
               <w:szCs w:val="24"/>
@@ -841,58 +804,50 @@
               <w14:ligatures w14:val="standardContextual"/>
             </w:rPr>
           </w:pPr>
-          <w:hyperlink w:anchor="_Toc227423382" w:history="1">
+          <w:hyperlink w:anchor="_Toc227491229" w:history="1">
             <w:r>
               <w:rPr>
                 <w:rStyle w:val="Hyperlink"/>
-                <w:noProof/>
               </w:rPr>
               <w:t>Current Website Analysis</w:t>
             </w:r>
             <w:r>
               <w:rPr>
-                <w:noProof/>
                 <w:webHidden/>
               </w:rPr>
               <w:tab/>
             </w:r>
             <w:r>
               <w:rPr>
-                <w:noProof/>
                 <w:webHidden/>
               </w:rPr>
               <w:fldChar w:fldCharType="begin"/>
             </w:r>
             <w:r>
               <w:rPr>
-                <w:noProof/>
-                <w:webHidden/>
-              </w:rPr>
-              <w:instrText xml:space="preserve"> PAGEREF _Toc227423382 \h </w:instrText>
-            </w:r>
-            <w:r>
-              <w:rPr>
-                <w:noProof/>
-                <w:webHidden/>
-              </w:rPr>
-            </w:r>
-            <w:r>
-              <w:rPr>
-                <w:noProof/>
+                <w:webHidden/>
+              </w:rPr>
+              <w:instrText xml:space="preserve"> PAGEREF _Toc227491229 \h </w:instrText>
+            </w:r>
+            <w:r>
+              <w:rPr>
+                <w:webHidden/>
+              </w:rPr>
+            </w:r>
+            <w:r>
+              <w:rPr>
                 <w:webHidden/>
               </w:rPr>
               <w:fldChar w:fldCharType="separate"/>
             </w:r>
             <w:r>
               <w:rPr>
-                <w:noProof/>
-                <w:webHidden/>
-              </w:rPr>
-              <w:t>4</w:t>
-            </w:r>
-            <w:r>
-              <w:rPr>
-                <w:noProof/>
+                <w:webHidden/>
+              </w:rPr>
+              <w:t>3</w:t>
+            </w:r>
+            <w:r>
+              <w:rPr>
                 <w:webHidden/>
               </w:rPr>
               <w:fldChar w:fldCharType="end"/>
@@ -907,7 +862,6 @@
             </w:tabs>
             <w:rPr>
               <w:rFonts w:eastAsiaTheme="minorEastAsia"/>
-              <w:noProof/>
               <w:kern w:val="2"/>
               <w:sz w:val="24"/>
               <w:szCs w:val="24"/>
@@ -915,58 +869,50 @@
               <w14:ligatures w14:val="standardContextual"/>
             </w:rPr>
           </w:pPr>
-          <w:hyperlink w:anchor="_Toc227423383" w:history="1">
+          <w:hyperlink w:anchor="_Toc227491230" w:history="1">
             <w:r>
               <w:rPr>
                 <w:rStyle w:val="Hyperlink"/>
-                <w:noProof/>
               </w:rPr>
               <w:t>Proposed website features and functionality</w:t>
             </w:r>
             <w:r>
               <w:rPr>
-                <w:noProof/>
                 <w:webHidden/>
               </w:rPr>
               <w:tab/>
             </w:r>
             <w:r>
               <w:rPr>
-                <w:noProof/>
                 <w:webHidden/>
               </w:rPr>
               <w:fldChar w:fldCharType="begin"/>
             </w:r>
             <w:r>
               <w:rPr>
-                <w:noProof/>
-                <w:webHidden/>
-              </w:rPr>
-              <w:instrText xml:space="preserve"> PAGEREF _Toc227423383 \h </w:instrText>
-            </w:r>
-            <w:r>
-              <w:rPr>
-                <w:noProof/>
-                <w:webHidden/>
-              </w:rPr>
-            </w:r>
-            <w:r>
-              <w:rPr>
-                <w:noProof/>
+                <w:webHidden/>
+              </w:rPr>
+              <w:instrText xml:space="preserve"> PAGEREF _Toc227491230 \h </w:instrText>
+            </w:r>
+            <w:r>
+              <w:rPr>
+                <w:webHidden/>
+              </w:rPr>
+            </w:r>
+            <w:r>
+              <w:rPr>
                 <w:webHidden/>
               </w:rPr>
               <w:fldChar w:fldCharType="separate"/>
             </w:r>
             <w:r>
               <w:rPr>
-                <w:noProof/>
-                <w:webHidden/>
-              </w:rPr>
-              <w:t>5</w:t>
-            </w:r>
-            <w:r>
-              <w:rPr>
-                <w:noProof/>
+                <w:webHidden/>
+              </w:rPr>
+              <w:t>4</w:t>
+            </w:r>
+            <w:r>
+              <w:rPr>
                 <w:webHidden/>
               </w:rPr>
               <w:fldChar w:fldCharType="end"/>
@@ -981,7 +927,6 @@
             </w:tabs>
             <w:rPr>
               <w:rFonts w:eastAsiaTheme="minorEastAsia"/>
-              <w:noProof/>
               <w:kern w:val="2"/>
               <w:sz w:val="24"/>
               <w:szCs w:val="24"/>
@@ -989,58 +934,50 @@
               <w14:ligatures w14:val="standardContextual"/>
             </w:rPr>
           </w:pPr>
-          <w:hyperlink w:anchor="_Toc227423384" w:history="1">
+          <w:hyperlink w:anchor="_Toc227491231" w:history="1">
             <w:r>
               <w:rPr>
                 <w:rStyle w:val="Hyperlink"/>
-                <w:noProof/>
               </w:rPr>
               <w:t>Design and User Experience</w:t>
             </w:r>
             <w:r>
               <w:rPr>
-                <w:noProof/>
                 <w:webHidden/>
               </w:rPr>
               <w:tab/>
             </w:r>
             <w:r>
               <w:rPr>
-                <w:noProof/>
                 <w:webHidden/>
               </w:rPr>
               <w:fldChar w:fldCharType="begin"/>
             </w:r>
             <w:r>
               <w:rPr>
-                <w:noProof/>
-                <w:webHidden/>
-              </w:rPr>
-              <w:instrText xml:space="preserve"> PAGEREF _Toc227423384 \h </w:instrText>
-            </w:r>
-            <w:r>
-              <w:rPr>
-                <w:noProof/>
-                <w:webHidden/>
-              </w:rPr>
-            </w:r>
-            <w:r>
-              <w:rPr>
-                <w:noProof/>
+                <w:webHidden/>
+              </w:rPr>
+              <w:instrText xml:space="preserve"> PAGEREF _Toc227491231 \h </w:instrText>
+            </w:r>
+            <w:r>
+              <w:rPr>
+                <w:webHidden/>
+              </w:rPr>
+            </w:r>
+            <w:r>
+              <w:rPr>
                 <w:webHidden/>
               </w:rPr>
               <w:fldChar w:fldCharType="separate"/>
             </w:r>
             <w:r>
               <w:rPr>
-                <w:noProof/>
-                <w:webHidden/>
-              </w:rPr>
-              <w:t>5</w:t>
-            </w:r>
-            <w:r>
-              <w:rPr>
-                <w:noProof/>
+                <w:webHidden/>
+              </w:rPr>
+              <w:t>4</w:t>
+            </w:r>
+            <w:r>
+              <w:rPr>
                 <w:webHidden/>
               </w:rPr>
               <w:fldChar w:fldCharType="end"/>
@@ -1055,7 +992,6 @@
             </w:tabs>
             <w:rPr>
               <w:rFonts w:eastAsiaTheme="minorEastAsia"/>
-              <w:noProof/>
               <w:kern w:val="2"/>
               <w:sz w:val="24"/>
               <w:szCs w:val="24"/>
@@ -1063,58 +999,50 @@
               <w14:ligatures w14:val="standardContextual"/>
             </w:rPr>
           </w:pPr>
-          <w:hyperlink w:anchor="_Toc227423385" w:history="1">
+          <w:hyperlink w:anchor="_Toc227491232" w:history="1">
             <w:r>
               <w:rPr>
                 <w:rStyle w:val="Hyperlink"/>
-                <w:noProof/>
               </w:rPr>
               <w:t>Colour scheme</w:t>
             </w:r>
             <w:r>
               <w:rPr>
-                <w:noProof/>
                 <w:webHidden/>
               </w:rPr>
               <w:tab/>
             </w:r>
             <w:r>
               <w:rPr>
-                <w:noProof/>
                 <w:webHidden/>
               </w:rPr>
               <w:fldChar w:fldCharType="begin"/>
             </w:r>
             <w:r>
               <w:rPr>
-                <w:noProof/>
-                <w:webHidden/>
-              </w:rPr>
-              <w:instrText xml:space="preserve"> PAGEREF _Toc227423385 \h </w:instrText>
-            </w:r>
-            <w:r>
-              <w:rPr>
-                <w:noProof/>
-                <w:webHidden/>
-              </w:rPr>
-            </w:r>
-            <w:r>
-              <w:rPr>
-                <w:noProof/>
+                <w:webHidden/>
+              </w:rPr>
+              <w:instrText xml:space="preserve"> PAGEREF _Toc227491232 \h </w:instrText>
+            </w:r>
+            <w:r>
+              <w:rPr>
+                <w:webHidden/>
+              </w:rPr>
+            </w:r>
+            <w:r>
+              <w:rPr>
                 <w:webHidden/>
               </w:rPr>
               <w:fldChar w:fldCharType="separate"/>
             </w:r>
             <w:r>
               <w:rPr>
-                <w:noProof/>
-                <w:webHidden/>
-              </w:rPr>
-              <w:t>5</w:t>
-            </w:r>
-            <w:r>
-              <w:rPr>
-                <w:noProof/>
+                <w:webHidden/>
+              </w:rPr>
+              <w:t>4</w:t>
+            </w:r>
+            <w:r>
+              <w:rPr>
                 <w:webHidden/>
               </w:rPr>
               <w:fldChar w:fldCharType="end"/>
@@ -1129,7 +1057,6 @@
             </w:tabs>
             <w:rPr>
               <w:rFonts w:eastAsiaTheme="minorEastAsia"/>
-              <w:noProof/>
               <w:kern w:val="2"/>
               <w:sz w:val="24"/>
               <w:szCs w:val="24"/>
@@ -1137,58 +1064,50 @@
               <w14:ligatures w14:val="standardContextual"/>
             </w:rPr>
           </w:pPr>
-          <w:hyperlink w:anchor="_Toc227423386" w:history="1">
+          <w:hyperlink w:anchor="_Toc227491233" w:history="1">
             <w:r>
               <w:rPr>
                 <w:rStyle w:val="Hyperlink"/>
-                <w:noProof/>
               </w:rPr>
               <w:t>Typography</w:t>
             </w:r>
             <w:r>
               <w:rPr>
-                <w:noProof/>
                 <w:webHidden/>
               </w:rPr>
               <w:tab/>
             </w:r>
             <w:r>
               <w:rPr>
-                <w:noProof/>
                 <w:webHidden/>
               </w:rPr>
               <w:fldChar w:fldCharType="begin"/>
             </w:r>
             <w:r>
               <w:rPr>
-                <w:noProof/>
-                <w:webHidden/>
-              </w:rPr>
-              <w:instrText xml:space="preserve"> PAGEREF _Toc227423386 \h </w:instrText>
-            </w:r>
-            <w:r>
-              <w:rPr>
-                <w:noProof/>
-                <w:webHidden/>
-              </w:rPr>
-            </w:r>
-            <w:r>
-              <w:rPr>
-                <w:noProof/>
+                <w:webHidden/>
+              </w:rPr>
+              <w:instrText xml:space="preserve"> PAGEREF _Toc227491233 \h </w:instrText>
+            </w:r>
+            <w:r>
+              <w:rPr>
+                <w:webHidden/>
+              </w:rPr>
+            </w:r>
+            <w:r>
+              <w:rPr>
                 <w:webHidden/>
               </w:rPr>
               <w:fldChar w:fldCharType="separate"/>
             </w:r>
             <w:r>
               <w:rPr>
-                <w:noProof/>
-                <w:webHidden/>
-              </w:rPr>
-              <w:t>6</w:t>
-            </w:r>
-            <w:r>
-              <w:rPr>
-                <w:noProof/>
+                <w:webHidden/>
+              </w:rPr>
+              <w:t>5</w:t>
+            </w:r>
+            <w:r>
+              <w:rPr>
                 <w:webHidden/>
               </w:rPr>
               <w:fldChar w:fldCharType="end"/>
@@ -1203,7 +1122,6 @@
             </w:tabs>
             <w:rPr>
               <w:rFonts w:eastAsiaTheme="minorEastAsia"/>
-              <w:noProof/>
               <w:kern w:val="2"/>
               <w:sz w:val="24"/>
               <w:szCs w:val="24"/>
@@ -1211,58 +1129,50 @@
               <w14:ligatures w14:val="standardContextual"/>
             </w:rPr>
           </w:pPr>
-          <w:hyperlink w:anchor="_Toc227423387" w:history="1">
+          <w:hyperlink w:anchor="_Toc227491234" w:history="1">
             <w:r>
               <w:rPr>
                 <w:rStyle w:val="Hyperlink"/>
-                <w:noProof/>
               </w:rPr>
               <w:t>Technical Requirements</w:t>
             </w:r>
             <w:r>
               <w:rPr>
-                <w:noProof/>
                 <w:webHidden/>
               </w:rPr>
               <w:tab/>
             </w:r>
             <w:r>
               <w:rPr>
-                <w:noProof/>
                 <w:webHidden/>
               </w:rPr>
               <w:fldChar w:fldCharType="begin"/>
             </w:r>
             <w:r>
               <w:rPr>
-                <w:noProof/>
-                <w:webHidden/>
-              </w:rPr>
-              <w:instrText xml:space="preserve"> PAGEREF _Toc227423387 \h </w:instrText>
-            </w:r>
-            <w:r>
-              <w:rPr>
-                <w:noProof/>
-                <w:webHidden/>
-              </w:rPr>
-            </w:r>
-            <w:r>
-              <w:rPr>
-                <w:noProof/>
+                <w:webHidden/>
+              </w:rPr>
+              <w:instrText xml:space="preserve"> PAGEREF _Toc227491234 \h </w:instrText>
+            </w:r>
+            <w:r>
+              <w:rPr>
+                <w:webHidden/>
+              </w:rPr>
+            </w:r>
+            <w:r>
+              <w:rPr>
                 <w:webHidden/>
               </w:rPr>
               <w:fldChar w:fldCharType="separate"/>
             </w:r>
             <w:r>
               <w:rPr>
-                <w:noProof/>
-                <w:webHidden/>
-              </w:rPr>
-              <w:t>6</w:t>
-            </w:r>
-            <w:r>
-              <w:rPr>
-                <w:noProof/>
+                <w:webHidden/>
+              </w:rPr>
+              <w:t>5</w:t>
+            </w:r>
+            <w:r>
+              <w:rPr>
                 <w:webHidden/>
               </w:rPr>
               <w:fldChar w:fldCharType="end"/>
@@ -1277,7 +1187,6 @@
             </w:tabs>
             <w:rPr>
               <w:rFonts w:eastAsiaTheme="minorEastAsia"/>
-              <w:noProof/>
               <w:kern w:val="2"/>
               <w:sz w:val="24"/>
               <w:szCs w:val="24"/>
@@ -1285,58 +1194,50 @@
               <w14:ligatures w14:val="standardContextual"/>
             </w:rPr>
           </w:pPr>
-          <w:hyperlink w:anchor="_Toc227423388" w:history="1">
+          <w:hyperlink w:anchor="_Toc227491235" w:history="1">
             <w:r>
               <w:rPr>
                 <w:rStyle w:val="Hyperlink"/>
-                <w:noProof/>
               </w:rPr>
               <w:t>Timeline and Milestones</w:t>
             </w:r>
             <w:r>
               <w:rPr>
-                <w:noProof/>
                 <w:webHidden/>
               </w:rPr>
               <w:tab/>
             </w:r>
             <w:r>
               <w:rPr>
-                <w:noProof/>
                 <w:webHidden/>
               </w:rPr>
               <w:fldChar w:fldCharType="begin"/>
             </w:r>
             <w:r>
               <w:rPr>
-                <w:noProof/>
-                <w:webHidden/>
-              </w:rPr>
-              <w:instrText xml:space="preserve"> PAGEREF _Toc227423388 \h </w:instrText>
-            </w:r>
-            <w:r>
-              <w:rPr>
-                <w:noProof/>
-                <w:webHidden/>
-              </w:rPr>
-            </w:r>
-            <w:r>
-              <w:rPr>
-                <w:noProof/>
+                <w:webHidden/>
+              </w:rPr>
+              <w:instrText xml:space="preserve"> PAGEREF _Toc227491235 \h </w:instrText>
+            </w:r>
+            <w:r>
+              <w:rPr>
+                <w:webHidden/>
+              </w:rPr>
+            </w:r>
+            <w:r>
+              <w:rPr>
                 <w:webHidden/>
               </w:rPr>
               <w:fldChar w:fldCharType="separate"/>
             </w:r>
             <w:r>
               <w:rPr>
-                <w:noProof/>
-                <w:webHidden/>
-              </w:rPr>
-              <w:t>6</w:t>
-            </w:r>
-            <w:r>
-              <w:rPr>
-                <w:noProof/>
+                <w:webHidden/>
+              </w:rPr>
+              <w:t>5</w:t>
+            </w:r>
+            <w:r>
+              <w:rPr>
                 <w:webHidden/>
               </w:rPr>
               <w:fldChar w:fldCharType="end"/>
@@ -1351,7 +1252,6 @@
             </w:tabs>
             <w:rPr>
               <w:rFonts w:eastAsiaTheme="minorEastAsia"/>
-              <w:noProof/>
               <w:kern w:val="2"/>
               <w:sz w:val="24"/>
               <w:szCs w:val="24"/>
@@ -1359,58 +1259,50 @@
               <w14:ligatures w14:val="standardContextual"/>
             </w:rPr>
           </w:pPr>
-          <w:hyperlink w:anchor="_Toc227423389" w:history="1">
+          <w:hyperlink w:anchor="_Toc227491236" w:history="1">
             <w:r>
               <w:rPr>
                 <w:rStyle w:val="Hyperlink"/>
-                <w:noProof/>
               </w:rPr>
               <w:t>Budget</w:t>
             </w:r>
             <w:r>
               <w:rPr>
-                <w:noProof/>
                 <w:webHidden/>
               </w:rPr>
               <w:tab/>
             </w:r>
             <w:r>
               <w:rPr>
-                <w:noProof/>
                 <w:webHidden/>
               </w:rPr>
               <w:fldChar w:fldCharType="begin"/>
             </w:r>
             <w:r>
               <w:rPr>
-                <w:noProof/>
-                <w:webHidden/>
-              </w:rPr>
-              <w:instrText xml:space="preserve"> PAGEREF _Toc227423389 \h </w:instrText>
-            </w:r>
-            <w:r>
-              <w:rPr>
-                <w:noProof/>
-                <w:webHidden/>
-              </w:rPr>
-            </w:r>
-            <w:r>
-              <w:rPr>
-                <w:noProof/>
+                <w:webHidden/>
+              </w:rPr>
+              <w:instrText xml:space="preserve"> PAGEREF _Toc227491236 \h </w:instrText>
+            </w:r>
+            <w:r>
+              <w:rPr>
+                <w:webHidden/>
+              </w:rPr>
+            </w:r>
+            <w:r>
+              <w:rPr>
                 <w:webHidden/>
               </w:rPr>
               <w:fldChar w:fldCharType="separate"/>
             </w:r>
             <w:r>
               <w:rPr>
-                <w:noProof/>
-                <w:webHidden/>
-              </w:rPr>
-              <w:t>7</w:t>
-            </w:r>
-            <w:r>
-              <w:rPr>
-                <w:noProof/>
+                <w:webHidden/>
+              </w:rPr>
+              <w:t>6</w:t>
+            </w:r>
+            <w:r>
+              <w:rPr>
                 <w:webHidden/>
               </w:rPr>
               <w:fldChar w:fldCharType="end"/>
@@ -1425,7 +1317,6 @@
             </w:tabs>
             <w:rPr>
               <w:rFonts w:eastAsiaTheme="minorEastAsia"/>
-              <w:noProof/>
               <w:kern w:val="2"/>
               <w:sz w:val="24"/>
               <w:szCs w:val="24"/>
@@ -1433,58 +1324,50 @@
               <w14:ligatures w14:val="standardContextual"/>
             </w:rPr>
           </w:pPr>
-          <w:hyperlink w:anchor="_Toc227423390" w:history="1">
+          <w:hyperlink w:anchor="_Toc227491237" w:history="1">
             <w:r>
               <w:rPr>
                 <w:rStyle w:val="Hyperlink"/>
-                <w:noProof/>
               </w:rPr>
               <w:t>Content Research and sourcing</w:t>
             </w:r>
             <w:r>
               <w:rPr>
-                <w:noProof/>
                 <w:webHidden/>
               </w:rPr>
               <w:tab/>
             </w:r>
             <w:r>
               <w:rPr>
-                <w:noProof/>
                 <w:webHidden/>
               </w:rPr>
               <w:fldChar w:fldCharType="begin"/>
             </w:r>
             <w:r>
               <w:rPr>
-                <w:noProof/>
-                <w:webHidden/>
-              </w:rPr>
-              <w:instrText xml:space="preserve"> PAGEREF _Toc227423390 \h </w:instrText>
-            </w:r>
-            <w:r>
-              <w:rPr>
-                <w:noProof/>
-                <w:webHidden/>
-              </w:rPr>
-            </w:r>
-            <w:r>
-              <w:rPr>
-                <w:noProof/>
+                <w:webHidden/>
+              </w:rPr>
+              <w:instrText xml:space="preserve"> PAGEREF _Toc227491237 \h </w:instrText>
+            </w:r>
+            <w:r>
+              <w:rPr>
+                <w:webHidden/>
+              </w:rPr>
+            </w:r>
+            <w:r>
+              <w:rPr>
                 <w:webHidden/>
               </w:rPr>
               <w:fldChar w:fldCharType="separate"/>
             </w:r>
             <w:r>
               <w:rPr>
-                <w:noProof/>
-                <w:webHidden/>
-              </w:rPr>
-              <w:t>7</w:t>
-            </w:r>
-            <w:r>
-              <w:rPr>
-                <w:noProof/>
+                <w:webHidden/>
+              </w:rPr>
+              <w:t>6</w:t>
+            </w:r>
+            <w:r>
+              <w:rPr>
                 <w:webHidden/>
               </w:rPr>
               <w:fldChar w:fldCharType="end"/>
@@ -1499,7 +1382,6 @@
             </w:tabs>
             <w:rPr>
               <w:rFonts w:eastAsiaTheme="minorEastAsia"/>
-              <w:noProof/>
               <w:kern w:val="2"/>
               <w:sz w:val="24"/>
               <w:szCs w:val="24"/>
@@ -1507,58 +1389,50 @@
               <w14:ligatures w14:val="standardContextual"/>
             </w:rPr>
           </w:pPr>
-          <w:hyperlink w:anchor="_Toc227423391" w:history="1">
+          <w:hyperlink w:anchor="_Toc227491238" w:history="1">
             <w:r>
               <w:rPr>
                 <w:rStyle w:val="Hyperlink"/>
-                <w:noProof/>
               </w:rPr>
               <w:t>Website Structure and Planning</w:t>
             </w:r>
             <w:r>
               <w:rPr>
-                <w:noProof/>
                 <w:webHidden/>
               </w:rPr>
               <w:tab/>
             </w:r>
             <w:r>
               <w:rPr>
-                <w:noProof/>
                 <w:webHidden/>
               </w:rPr>
               <w:fldChar w:fldCharType="begin"/>
             </w:r>
             <w:r>
               <w:rPr>
-                <w:noProof/>
-                <w:webHidden/>
-              </w:rPr>
-              <w:instrText xml:space="preserve"> PAGEREF _Toc227423391 \h </w:instrText>
-            </w:r>
-            <w:r>
-              <w:rPr>
-                <w:noProof/>
-                <w:webHidden/>
-              </w:rPr>
-            </w:r>
-            <w:r>
-              <w:rPr>
-                <w:noProof/>
+                <w:webHidden/>
+              </w:rPr>
+              <w:instrText xml:space="preserve"> PAGEREF _Toc227491238 \h </w:instrText>
+            </w:r>
+            <w:r>
+              <w:rPr>
+                <w:webHidden/>
+              </w:rPr>
+            </w:r>
+            <w:r>
+              <w:rPr>
                 <w:webHidden/>
               </w:rPr>
               <w:fldChar w:fldCharType="separate"/>
             </w:r>
             <w:r>
               <w:rPr>
-                <w:noProof/>
-                <w:webHidden/>
-              </w:rPr>
-              <w:t>7</w:t>
-            </w:r>
-            <w:r>
-              <w:rPr>
-                <w:noProof/>
+                <w:webHidden/>
+              </w:rPr>
+              <w:t>6</w:t>
+            </w:r>
+            <w:r>
+              <w:rPr>
                 <w:webHidden/>
               </w:rPr>
               <w:fldChar w:fldCharType="end"/>
@@ -1573,7 +1447,6 @@
             </w:tabs>
             <w:rPr>
               <w:rFonts w:eastAsiaTheme="minorEastAsia"/>
-              <w:noProof/>
               <w:kern w:val="2"/>
               <w:sz w:val="24"/>
               <w:szCs w:val="24"/>
@@ -1581,58 +1454,50 @@
               <w14:ligatures w14:val="standardContextual"/>
             </w:rPr>
           </w:pPr>
-          <w:hyperlink w:anchor="_Toc227423392" w:history="1">
+          <w:hyperlink w:anchor="_Toc227491239" w:history="1">
             <w:r>
               <w:rPr>
                 <w:rStyle w:val="Hyperlink"/>
-                <w:noProof/>
               </w:rPr>
               <w:t>Sitemap</w:t>
             </w:r>
             <w:r>
               <w:rPr>
-                <w:noProof/>
                 <w:webHidden/>
               </w:rPr>
               <w:tab/>
             </w:r>
             <w:r>
               <w:rPr>
-                <w:noProof/>
                 <w:webHidden/>
               </w:rPr>
               <w:fldChar w:fldCharType="begin"/>
             </w:r>
             <w:r>
               <w:rPr>
-                <w:noProof/>
-                <w:webHidden/>
-              </w:rPr>
-              <w:instrText xml:space="preserve"> PAGEREF _Toc227423392 \h </w:instrText>
-            </w:r>
-            <w:r>
-              <w:rPr>
-                <w:noProof/>
-                <w:webHidden/>
-              </w:rPr>
-            </w:r>
-            <w:r>
-              <w:rPr>
-                <w:noProof/>
+                <w:webHidden/>
+              </w:rPr>
+              <w:instrText xml:space="preserve"> PAGEREF _Toc227491239 \h </w:instrText>
+            </w:r>
+            <w:r>
+              <w:rPr>
+                <w:webHidden/>
+              </w:rPr>
+            </w:r>
+            <w:r>
+              <w:rPr>
                 <w:webHidden/>
               </w:rPr>
               <w:fldChar w:fldCharType="separate"/>
             </w:r>
             <w:r>
               <w:rPr>
-                <w:noProof/>
-                <w:webHidden/>
-              </w:rPr>
-              <w:t>7</w:t>
-            </w:r>
-            <w:r>
-              <w:rPr>
-                <w:noProof/>
+                <w:webHidden/>
+              </w:rPr>
+              <w:t>6</w:t>
+            </w:r>
+            <w:r>
+              <w:rPr>
                 <w:webHidden/>
               </w:rPr>
               <w:fldChar w:fldCharType="end"/>
@@ -1647,7 +1512,6 @@
             </w:tabs>
             <w:rPr>
               <w:rFonts w:eastAsiaTheme="minorEastAsia"/>
-              <w:noProof/>
               <w:kern w:val="2"/>
               <w:sz w:val="24"/>
               <w:szCs w:val="24"/>
@@ -1655,58 +1519,50 @@
               <w14:ligatures w14:val="standardContextual"/>
             </w:rPr>
           </w:pPr>
-          <w:hyperlink w:anchor="_Toc227423393" w:history="1">
+          <w:hyperlink w:anchor="_Toc227491240" w:history="1">
             <w:r>
               <w:rPr>
                 <w:rStyle w:val="Hyperlink"/>
-                <w:noProof/>
               </w:rPr>
               <w:t>Page structure - contents</w:t>
             </w:r>
             <w:r>
               <w:rPr>
-                <w:noProof/>
                 <w:webHidden/>
               </w:rPr>
               <w:tab/>
             </w:r>
             <w:r>
               <w:rPr>
-                <w:noProof/>
                 <w:webHidden/>
               </w:rPr>
               <w:fldChar w:fldCharType="begin"/>
             </w:r>
             <w:r>
               <w:rPr>
-                <w:noProof/>
-                <w:webHidden/>
-              </w:rPr>
-              <w:instrText xml:space="preserve"> PAGEREF _Toc227423393 \h </w:instrText>
-            </w:r>
-            <w:r>
-              <w:rPr>
-                <w:noProof/>
-                <w:webHidden/>
-              </w:rPr>
-            </w:r>
-            <w:r>
-              <w:rPr>
-                <w:noProof/>
+                <w:webHidden/>
+              </w:rPr>
+              <w:instrText xml:space="preserve"> PAGEREF _Toc227491240 \h </w:instrText>
+            </w:r>
+            <w:r>
+              <w:rPr>
+                <w:webHidden/>
+              </w:rPr>
+            </w:r>
+            <w:r>
+              <w:rPr>
                 <w:webHidden/>
               </w:rPr>
               <w:fldChar w:fldCharType="separate"/>
             </w:r>
             <w:r>
               <w:rPr>
-                <w:noProof/>
-                <w:webHidden/>
-              </w:rPr>
-              <w:t>7</w:t>
-            </w:r>
-            <w:r>
-              <w:rPr>
-                <w:noProof/>
+                <w:webHidden/>
+              </w:rPr>
+              <w:t>6</w:t>
+            </w:r>
+            <w:r>
+              <w:rPr>
                 <w:webHidden/>
               </w:rPr>
               <w:fldChar w:fldCharType="end"/>
@@ -1722,7 +1578,6 @@
             </w:tabs>
             <w:rPr>
               <w:rFonts w:eastAsiaTheme="minorEastAsia"/>
-              <w:noProof/>
               <w:kern w:val="2"/>
               <w:sz w:val="24"/>
               <w:szCs w:val="24"/>
@@ -1730,18 +1585,16 @@
               <w14:ligatures w14:val="standardContextual"/>
             </w:rPr>
           </w:pPr>
-          <w:hyperlink w:anchor="_Toc227423394" w:history="1">
+          <w:hyperlink w:anchor="_Toc227491241" w:history="1">
             <w:r>
               <w:rPr>
                 <w:rStyle w:val="Hyperlink"/>
-                <w:noProof/>
               </w:rPr>
               <w:t>1.</w:t>
             </w:r>
             <w:r>
               <w:rPr>
                 <w:rFonts w:eastAsiaTheme="minorEastAsia"/>
-                <w:noProof/>
                 <w:kern w:val="2"/>
                 <w:sz w:val="24"/>
                 <w:szCs w:val="24"/>
@@ -1753,54 +1606,46 @@
             <w:r>
               <w:rPr>
                 <w:rStyle w:val="Hyperlink"/>
-                <w:noProof/>
               </w:rPr>
               <w:t>Homepage</w:t>
             </w:r>
             <w:r>
               <w:rPr>
-                <w:noProof/>
                 <w:webHidden/>
               </w:rPr>
               <w:tab/>
             </w:r>
             <w:r>
               <w:rPr>
-                <w:noProof/>
                 <w:webHidden/>
               </w:rPr>
               <w:fldChar w:fldCharType="begin"/>
             </w:r>
             <w:r>
               <w:rPr>
-                <w:noProof/>
-                <w:webHidden/>
-              </w:rPr>
-              <w:instrText xml:space="preserve"> PAGEREF _Toc227423394 \h </w:instrText>
-            </w:r>
-            <w:r>
-              <w:rPr>
-                <w:noProof/>
-                <w:webHidden/>
-              </w:rPr>
-            </w:r>
-            <w:r>
-              <w:rPr>
-                <w:noProof/>
+                <w:webHidden/>
+              </w:rPr>
+              <w:instrText xml:space="preserve"> PAGEREF _Toc227491241 \h </w:instrText>
+            </w:r>
+            <w:r>
+              <w:rPr>
+                <w:webHidden/>
+              </w:rPr>
+            </w:r>
+            <w:r>
+              <w:rPr>
                 <w:webHidden/>
               </w:rPr>
               <w:fldChar w:fldCharType="separate"/>
             </w:r>
             <w:r>
               <w:rPr>
-                <w:noProof/>
-                <w:webHidden/>
-              </w:rPr>
-              <w:t>7</w:t>
-            </w:r>
-            <w:r>
-              <w:rPr>
-                <w:noProof/>
+                <w:webHidden/>
+              </w:rPr>
+              <w:t>6</w:t>
+            </w:r>
+            <w:r>
+              <w:rPr>
                 <w:webHidden/>
               </w:rPr>
               <w:fldChar w:fldCharType="end"/>
@@ -1816,7 +1661,6 @@
             </w:tabs>
             <w:rPr>
               <w:rFonts w:eastAsiaTheme="minorEastAsia"/>
-              <w:noProof/>
               <w:kern w:val="2"/>
               <w:sz w:val="24"/>
               <w:szCs w:val="24"/>
@@ -1824,18 +1668,16 @@
               <w14:ligatures w14:val="standardContextual"/>
             </w:rPr>
           </w:pPr>
-          <w:hyperlink w:anchor="_Toc227423395" w:history="1">
+          <w:hyperlink w:anchor="_Toc227491242" w:history="1">
             <w:r>
               <w:rPr>
                 <w:rStyle w:val="Hyperlink"/>
-                <w:noProof/>
               </w:rPr>
               <w:t>2.</w:t>
             </w:r>
             <w:r>
               <w:rPr>
                 <w:rFonts w:eastAsiaTheme="minorEastAsia"/>
-                <w:noProof/>
                 <w:kern w:val="2"/>
                 <w:sz w:val="24"/>
                 <w:szCs w:val="24"/>
@@ -1847,54 +1689,46 @@
             <w:r>
               <w:rPr>
                 <w:rStyle w:val="Hyperlink"/>
-                <w:noProof/>
               </w:rPr>
               <w:t>About us</w:t>
             </w:r>
             <w:r>
               <w:rPr>
-                <w:noProof/>
                 <w:webHidden/>
               </w:rPr>
               <w:tab/>
             </w:r>
             <w:r>
               <w:rPr>
-                <w:noProof/>
                 <w:webHidden/>
               </w:rPr>
               <w:fldChar w:fldCharType="begin"/>
             </w:r>
             <w:r>
               <w:rPr>
-                <w:noProof/>
-                <w:webHidden/>
-              </w:rPr>
-              <w:instrText xml:space="preserve"> PAGEREF _Toc227423395 \h </w:instrText>
-            </w:r>
-            <w:r>
-              <w:rPr>
-                <w:noProof/>
-                <w:webHidden/>
-              </w:rPr>
-            </w:r>
-            <w:r>
-              <w:rPr>
-                <w:noProof/>
+                <w:webHidden/>
+              </w:rPr>
+              <w:instrText xml:space="preserve"> PAGEREF _Toc227491242 \h </w:instrText>
+            </w:r>
+            <w:r>
+              <w:rPr>
+                <w:webHidden/>
+              </w:rPr>
+            </w:r>
+            <w:r>
+              <w:rPr>
                 <w:webHidden/>
               </w:rPr>
               <w:fldChar w:fldCharType="separate"/>
             </w:r>
             <w:r>
               <w:rPr>
-                <w:noProof/>
-                <w:webHidden/>
-              </w:rPr>
-              <w:t>8</w:t>
-            </w:r>
-            <w:r>
-              <w:rPr>
-                <w:noProof/>
+                <w:webHidden/>
+              </w:rPr>
+              <w:t>7</w:t>
+            </w:r>
+            <w:r>
+              <w:rPr>
                 <w:webHidden/>
               </w:rPr>
               <w:fldChar w:fldCharType="end"/>
@@ -1910,7 +1744,6 @@
             </w:tabs>
             <w:rPr>
               <w:rFonts w:eastAsiaTheme="minorEastAsia"/>
-              <w:noProof/>
               <w:kern w:val="2"/>
               <w:sz w:val="24"/>
               <w:szCs w:val="24"/>
@@ -1918,18 +1751,16 @@
               <w14:ligatures w14:val="standardContextual"/>
             </w:rPr>
           </w:pPr>
-          <w:hyperlink w:anchor="_Toc227423396" w:history="1">
+          <w:hyperlink w:anchor="_Toc227491243" w:history="1">
             <w:r>
               <w:rPr>
                 <w:rStyle w:val="Hyperlink"/>
-                <w:noProof/>
               </w:rPr>
               <w:t>3.</w:t>
             </w:r>
             <w:r>
               <w:rPr>
                 <w:rFonts w:eastAsiaTheme="minorEastAsia"/>
-                <w:noProof/>
                 <w:kern w:val="2"/>
                 <w:sz w:val="24"/>
                 <w:szCs w:val="24"/>
@@ -1941,54 +1772,46 @@
             <w:r>
               <w:rPr>
                 <w:rStyle w:val="Hyperlink"/>
-                <w:noProof/>
               </w:rPr>
               <w:t>Directory</w:t>
             </w:r>
             <w:r>
               <w:rPr>
-                <w:noProof/>
                 <w:webHidden/>
               </w:rPr>
               <w:tab/>
             </w:r>
             <w:r>
               <w:rPr>
-                <w:noProof/>
                 <w:webHidden/>
               </w:rPr>
               <w:fldChar w:fldCharType="begin"/>
             </w:r>
             <w:r>
               <w:rPr>
-                <w:noProof/>
-                <w:webHidden/>
-              </w:rPr>
-              <w:instrText xml:space="preserve"> PAGEREF _Toc227423396 \h </w:instrText>
-            </w:r>
-            <w:r>
-              <w:rPr>
-                <w:noProof/>
-                <w:webHidden/>
-              </w:rPr>
-            </w:r>
-            <w:r>
-              <w:rPr>
-                <w:noProof/>
+                <w:webHidden/>
+              </w:rPr>
+              <w:instrText xml:space="preserve"> PAGEREF _Toc227491243 \h </w:instrText>
+            </w:r>
+            <w:r>
+              <w:rPr>
+                <w:webHidden/>
+              </w:rPr>
+            </w:r>
+            <w:r>
+              <w:rPr>
                 <w:webHidden/>
               </w:rPr>
               <w:fldChar w:fldCharType="separate"/>
             </w:r>
             <w:r>
               <w:rPr>
-                <w:noProof/>
-                <w:webHidden/>
-              </w:rPr>
-              <w:t>9</w:t>
-            </w:r>
-            <w:r>
-              <w:rPr>
-                <w:noProof/>
+                <w:webHidden/>
+              </w:rPr>
+              <w:t>8</w:t>
+            </w:r>
+            <w:r>
+              <w:rPr>
                 <w:webHidden/>
               </w:rPr>
               <w:fldChar w:fldCharType="end"/>
@@ -2004,7 +1827,6 @@
             </w:tabs>
             <w:rPr>
               <w:rFonts w:eastAsiaTheme="minorEastAsia"/>
-              <w:noProof/>
               <w:kern w:val="2"/>
               <w:sz w:val="24"/>
               <w:szCs w:val="24"/>
@@ -2012,18 +1834,16 @@
               <w14:ligatures w14:val="standardContextual"/>
             </w:rPr>
           </w:pPr>
-          <w:hyperlink w:anchor="_Toc227423397" w:history="1">
+          <w:hyperlink w:anchor="_Toc227491244" w:history="1">
             <w:r>
               <w:rPr>
                 <w:rStyle w:val="Hyperlink"/>
-                <w:noProof/>
               </w:rPr>
               <w:t>4.</w:t>
             </w:r>
             <w:r>
               <w:rPr>
                 <w:rFonts w:eastAsiaTheme="minorEastAsia"/>
-                <w:noProof/>
                 <w:kern w:val="2"/>
                 <w:sz w:val="24"/>
                 <w:szCs w:val="24"/>
@@ -2035,54 +1855,46 @@
             <w:r>
               <w:rPr>
                 <w:rStyle w:val="Hyperlink"/>
-                <w:noProof/>
               </w:rPr>
               <w:t>Photo gallery</w:t>
             </w:r>
             <w:r>
               <w:rPr>
-                <w:noProof/>
                 <w:webHidden/>
               </w:rPr>
               <w:tab/>
             </w:r>
             <w:r>
               <w:rPr>
-                <w:noProof/>
                 <w:webHidden/>
               </w:rPr>
               <w:fldChar w:fldCharType="begin"/>
             </w:r>
             <w:r>
               <w:rPr>
-                <w:noProof/>
-                <w:webHidden/>
-              </w:rPr>
-              <w:instrText xml:space="preserve"> PAGEREF _Toc227423397 \h </w:instrText>
-            </w:r>
-            <w:r>
-              <w:rPr>
-                <w:noProof/>
-                <w:webHidden/>
-              </w:rPr>
-            </w:r>
-            <w:r>
-              <w:rPr>
-                <w:noProof/>
+                <w:webHidden/>
+              </w:rPr>
+              <w:instrText xml:space="preserve"> PAGEREF _Toc227491244 \h </w:instrText>
+            </w:r>
+            <w:r>
+              <w:rPr>
+                <w:webHidden/>
+              </w:rPr>
+            </w:r>
+            <w:r>
+              <w:rPr>
                 <w:webHidden/>
               </w:rPr>
               <w:fldChar w:fldCharType="separate"/>
             </w:r>
             <w:r>
               <w:rPr>
-                <w:noProof/>
-                <w:webHidden/>
-              </w:rPr>
-              <w:t>10</w:t>
-            </w:r>
-            <w:r>
-              <w:rPr>
-                <w:noProof/>
+                <w:webHidden/>
+              </w:rPr>
+              <w:t>9</w:t>
+            </w:r>
+            <w:r>
+              <w:rPr>
                 <w:webHidden/>
               </w:rPr>
               <w:fldChar w:fldCharType="end"/>
@@ -2098,7 +1910,6 @@
             </w:tabs>
             <w:rPr>
               <w:rFonts w:eastAsiaTheme="minorEastAsia"/>
-              <w:noProof/>
               <w:kern w:val="2"/>
               <w:sz w:val="24"/>
               <w:szCs w:val="24"/>
@@ -2106,18 +1917,16 @@
               <w14:ligatures w14:val="standardContextual"/>
             </w:rPr>
           </w:pPr>
-          <w:hyperlink w:anchor="_Toc227423398" w:history="1">
+          <w:hyperlink w:anchor="_Toc227491245" w:history="1">
             <w:r>
               <w:rPr>
                 <w:rStyle w:val="Hyperlink"/>
-                <w:noProof/>
               </w:rPr>
               <w:t>5.</w:t>
             </w:r>
             <w:r>
               <w:rPr>
                 <w:rFonts w:eastAsiaTheme="minorEastAsia"/>
-                <w:noProof/>
                 <w:kern w:val="2"/>
                 <w:sz w:val="24"/>
                 <w:szCs w:val="24"/>
@@ -2129,54 +1938,46 @@
             <w:r>
               <w:rPr>
                 <w:rStyle w:val="Hyperlink"/>
-                <w:noProof/>
               </w:rPr>
               <w:t>Devotions</w:t>
             </w:r>
             <w:r>
               <w:rPr>
-                <w:noProof/>
                 <w:webHidden/>
               </w:rPr>
               <w:tab/>
             </w:r>
             <w:r>
               <w:rPr>
-                <w:noProof/>
                 <w:webHidden/>
               </w:rPr>
               <w:fldChar w:fldCharType="begin"/>
             </w:r>
             <w:r>
               <w:rPr>
-                <w:noProof/>
-                <w:webHidden/>
-              </w:rPr>
-              <w:instrText xml:space="preserve"> PAGEREF _Toc227423398 \h </w:instrText>
-            </w:r>
-            <w:r>
-              <w:rPr>
-                <w:noProof/>
-                <w:webHidden/>
-              </w:rPr>
-            </w:r>
-            <w:r>
-              <w:rPr>
-                <w:noProof/>
+                <w:webHidden/>
+              </w:rPr>
+              <w:instrText xml:space="preserve"> PAGEREF _Toc227491245 \h </w:instrText>
+            </w:r>
+            <w:r>
+              <w:rPr>
+                <w:webHidden/>
+              </w:rPr>
+            </w:r>
+            <w:r>
+              <w:rPr>
                 <w:webHidden/>
               </w:rPr>
               <w:fldChar w:fldCharType="separate"/>
             </w:r>
             <w:r>
               <w:rPr>
-                <w:noProof/>
-                <w:webHidden/>
-              </w:rPr>
-              <w:t>10</w:t>
-            </w:r>
-            <w:r>
-              <w:rPr>
-                <w:noProof/>
+                <w:webHidden/>
+              </w:rPr>
+              <w:t>9</w:t>
+            </w:r>
+            <w:r>
+              <w:rPr>
                 <w:webHidden/>
               </w:rPr>
               <w:fldChar w:fldCharType="end"/>
@@ -2192,7 +1993,6 @@
             </w:tabs>
             <w:rPr>
               <w:rFonts w:eastAsiaTheme="minorEastAsia"/>
-              <w:noProof/>
               <w:kern w:val="2"/>
               <w:sz w:val="24"/>
               <w:szCs w:val="24"/>
@@ -2200,18 +2000,16 @@
               <w14:ligatures w14:val="standardContextual"/>
             </w:rPr>
           </w:pPr>
-          <w:hyperlink w:anchor="_Toc227423399" w:history="1">
+          <w:hyperlink w:anchor="_Toc227491246" w:history="1">
             <w:r>
               <w:rPr>
                 <w:rStyle w:val="Hyperlink"/>
-                <w:noProof/>
               </w:rPr>
               <w:t>6.</w:t>
             </w:r>
             <w:r>
               <w:rPr>
                 <w:rFonts w:eastAsiaTheme="minorEastAsia"/>
-                <w:noProof/>
                 <w:kern w:val="2"/>
                 <w:sz w:val="24"/>
                 <w:szCs w:val="24"/>
@@ -2223,54 +2021,46 @@
             <w:r>
               <w:rPr>
                 <w:rStyle w:val="Hyperlink"/>
-                <w:noProof/>
               </w:rPr>
               <w:t>Contact Us</w:t>
             </w:r>
             <w:r>
               <w:rPr>
-                <w:noProof/>
                 <w:webHidden/>
               </w:rPr>
               <w:tab/>
             </w:r>
             <w:r>
               <w:rPr>
-                <w:noProof/>
                 <w:webHidden/>
               </w:rPr>
               <w:fldChar w:fldCharType="begin"/>
             </w:r>
             <w:r>
               <w:rPr>
-                <w:noProof/>
-                <w:webHidden/>
-              </w:rPr>
-              <w:instrText xml:space="preserve"> PAGEREF _Toc227423399 \h </w:instrText>
-            </w:r>
-            <w:r>
-              <w:rPr>
-                <w:noProof/>
-                <w:webHidden/>
-              </w:rPr>
-            </w:r>
-            <w:r>
-              <w:rPr>
-                <w:noProof/>
+                <w:webHidden/>
+              </w:rPr>
+              <w:instrText xml:space="preserve"> PAGEREF _Toc227491246 \h </w:instrText>
+            </w:r>
+            <w:r>
+              <w:rPr>
+                <w:webHidden/>
+              </w:rPr>
+            </w:r>
+            <w:r>
+              <w:rPr>
                 <w:webHidden/>
               </w:rPr>
               <w:fldChar w:fldCharType="separate"/>
             </w:r>
             <w:r>
               <w:rPr>
-                <w:noProof/>
-                <w:webHidden/>
-              </w:rPr>
-              <w:t>10</w:t>
-            </w:r>
-            <w:r>
-              <w:rPr>
-                <w:noProof/>
+                <w:webHidden/>
+              </w:rPr>
+              <w:t>9</w:t>
+            </w:r>
+            <w:r>
+              <w:rPr>
                 <w:webHidden/>
               </w:rPr>
               <w:fldChar w:fldCharType="end"/>
@@ -2285,7 +2075,6 @@
             </w:tabs>
             <w:rPr>
               <w:rFonts w:eastAsiaTheme="minorEastAsia"/>
-              <w:noProof/>
               <w:kern w:val="2"/>
               <w:sz w:val="24"/>
               <w:szCs w:val="24"/>
@@ -2293,58 +2082,50 @@
               <w14:ligatures w14:val="standardContextual"/>
             </w:rPr>
           </w:pPr>
-          <w:hyperlink w:anchor="_Toc227423400" w:history="1">
+          <w:hyperlink w:anchor="_Toc227491247" w:history="1">
             <w:r>
               <w:rPr>
                 <w:rStyle w:val="Hyperlink"/>
-                <w:noProof/>
               </w:rPr>
               <w:t>GitHub Repository</w:t>
             </w:r>
             <w:r>
               <w:rPr>
-                <w:noProof/>
                 <w:webHidden/>
               </w:rPr>
               <w:tab/>
             </w:r>
             <w:r>
               <w:rPr>
-                <w:noProof/>
                 <w:webHidden/>
               </w:rPr>
               <w:fldChar w:fldCharType="begin"/>
             </w:r>
             <w:r>
               <w:rPr>
-                <w:noProof/>
-                <w:webHidden/>
-              </w:rPr>
-              <w:instrText xml:space="preserve"> PAGEREF _Toc227423400 \h </w:instrText>
-            </w:r>
-            <w:r>
-              <w:rPr>
-                <w:noProof/>
-                <w:webHidden/>
-              </w:rPr>
-            </w:r>
-            <w:r>
-              <w:rPr>
-                <w:noProof/>
+                <w:webHidden/>
+              </w:rPr>
+              <w:instrText xml:space="preserve"> PAGEREF _Toc227491247 \h </w:instrText>
+            </w:r>
+            <w:r>
+              <w:rPr>
+                <w:webHidden/>
+              </w:rPr>
+            </w:r>
+            <w:r>
+              <w:rPr>
                 <w:webHidden/>
               </w:rPr>
               <w:fldChar w:fldCharType="separate"/>
             </w:r>
             <w:r>
               <w:rPr>
-                <w:noProof/>
                 <w:webHidden/>
               </w:rPr>
               <w:t>10</w:t>
             </w:r>
             <w:r>
               <w:rPr>
-                <w:noProof/>
                 <w:webHidden/>
               </w:rPr>
               <w:fldChar w:fldCharType="end"/>
@@ -2359,7 +2140,6 @@
             </w:tabs>
             <w:rPr>
               <w:rFonts w:eastAsiaTheme="minorEastAsia"/>
-              <w:noProof/>
               <w:kern w:val="2"/>
               <w:sz w:val="24"/>
               <w:szCs w:val="24"/>
@@ -2367,58 +2147,50 @@
               <w14:ligatures w14:val="standardContextual"/>
             </w:rPr>
           </w:pPr>
-          <w:hyperlink w:anchor="_Toc227423401" w:history="1">
+          <w:hyperlink w:anchor="_Toc227491248" w:history="1">
             <w:r>
               <w:rPr>
                 <w:rStyle w:val="Hyperlink"/>
-                <w:noProof/>
               </w:rPr>
               <w:t>References</w:t>
             </w:r>
             <w:r>
               <w:rPr>
-                <w:noProof/>
                 <w:webHidden/>
               </w:rPr>
               <w:tab/>
             </w:r>
             <w:r>
               <w:rPr>
-                <w:noProof/>
                 <w:webHidden/>
               </w:rPr>
               <w:fldChar w:fldCharType="begin"/>
             </w:r>
             <w:r>
               <w:rPr>
-                <w:noProof/>
-                <w:webHidden/>
-              </w:rPr>
-              <w:instrText xml:space="preserve"> PAGEREF _Toc227423401 \h </w:instrText>
-            </w:r>
-            <w:r>
-              <w:rPr>
-                <w:noProof/>
-                <w:webHidden/>
-              </w:rPr>
-            </w:r>
-            <w:r>
-              <w:rPr>
-                <w:noProof/>
+                <w:webHidden/>
+              </w:rPr>
+              <w:instrText xml:space="preserve"> PAGEREF _Toc227491248 \h </w:instrText>
+            </w:r>
+            <w:r>
+              <w:rPr>
+                <w:webHidden/>
+              </w:rPr>
+            </w:r>
+            <w:r>
+              <w:rPr>
                 <w:webHidden/>
               </w:rPr>
               <w:fldChar w:fldCharType="separate"/>
             </w:r>
             <w:r>
               <w:rPr>
-                <w:noProof/>
-                <w:webHidden/>
-              </w:rPr>
-              <w:t>12</w:t>
-            </w:r>
-            <w:r>
-              <w:rPr>
-                <w:noProof/>
+                <w:webHidden/>
+              </w:rPr>
+              <w:t>11</w:t>
+            </w:r>
+            <w:r>
+              <w:rPr>
                 <w:webHidden/>
               </w:rPr>
               <w:fldChar w:fldCharType="end"/>
@@ -2430,7 +2202,6 @@
             <w:rPr>
               <w:b/>
               <w:bCs/>
-              <w:noProof/>
             </w:rPr>
             <w:fldChar w:fldCharType="end"/>
           </w:r>
@@ -2454,7 +2225,7 @@
       <w:pPr>
         <w:pStyle w:val="Heading1"/>
       </w:pPr>
-      <w:bookmarkStart w:id="0" w:name="_Toc227423377"/>
+      <w:bookmarkStart w:id="0" w:name="_Toc227491224"/>
       <w:r>
         <w:lastRenderedPageBreak/>
         <w:t>Organisation Overview</w:t>
@@ -2468,7 +2239,7 @@
           <w:u w:val="single"/>
         </w:rPr>
       </w:pPr>
-      <w:bookmarkStart w:id="1" w:name="_Toc227423378"/>
+      <w:bookmarkStart w:id="1" w:name="_Toc227491225"/>
       <w:r>
         <w:rPr>
           <w:u w:val="single"/>
@@ -2508,9 +2279,6 @@
     </w:p>
     <w:p>
       <w:r>
-        <w:rPr>
-          <w:noProof/>
-        </w:rPr>
         <w:drawing>
           <wp:inline distT="0" distB="0" distL="0" distR="0" wp14:anchorId="5F6F3294" wp14:editId="73B3B127">
             <wp:extent cx="1836420" cy="1836420"/>
@@ -2565,10 +2333,7 @@
         <w:t xml:space="preserve">, </w:t>
       </w:r>
       <w:r>
-        <w:t xml:space="preserve">the churches would incorporate the words Apostolic, Pentecostal or Faith to represent their biblical charter for example </w:t>
-      </w:r>
-      <w:r>
-        <w:t>Gospel church in Zion</w:t>
+        <w:t>the churches would incorporate the words Apostolic, Pentecostal or Faith to represent their biblical charter for example Gospel church in Zion</w:t>
       </w:r>
       <w:r>
         <w:t xml:space="preserve">. The Zion churches have different branches of churches such as the </w:t>
@@ -2579,48 +2344,14 @@
       <w:r>
         <w:t xml:space="preserve"> Christian church known as the ZCC of Limpopo, </w:t>
       </w:r>
-      <w:proofErr w:type="spellStart"/>
-      <w:r>
-        <w:t>AmaNazaretha</w:t>
-      </w:r>
-      <w:proofErr w:type="spellEnd"/>
-      <w:r>
-        <w:t xml:space="preserve"> formally known as the Shembe church or </w:t>
-      </w:r>
-      <w:proofErr w:type="spellStart"/>
-      <w:r>
-        <w:t>iBandla</w:t>
-      </w:r>
-      <w:proofErr w:type="spellEnd"/>
-      <w:r>
-        <w:t xml:space="preserve"> </w:t>
-      </w:r>
-      <w:proofErr w:type="spellStart"/>
-      <w:r>
-        <w:t>lamaNazaretha</w:t>
-      </w:r>
-      <w:proofErr w:type="spellEnd"/>
-      <w:r>
-        <w:t xml:space="preserve"> and</w:t>
-      </w:r>
-      <w:r>
-        <w:t xml:space="preserve"> </w:t>
-      </w:r>
-      <w:proofErr w:type="spellStart"/>
-      <w:r>
-        <w:t>AmaSiyoni</w:t>
-      </w:r>
-      <w:proofErr w:type="spellEnd"/>
-      <w:r>
-        <w:t xml:space="preserve"> or </w:t>
-      </w:r>
-      <w:proofErr w:type="spellStart"/>
-      <w:r>
-        <w:t>AmaKrestu</w:t>
-      </w:r>
-      <w:proofErr w:type="spellEnd"/>
-      <w:r>
-        <w:t xml:space="preserve"> of KwaZulu Natal</w:t>
+      <w:r>
+        <w:t xml:space="preserve">AmaNazaretha formally known as the Shembe church or iBandla </w:t>
+      </w:r>
+      <w:r>
+        <w:t>lamaNazaretha and</w:t>
+      </w:r>
+      <w:r>
+        <w:t xml:space="preserve"> AmaSiyoni or AmaKrestu of KwaZulu Natal</w:t>
       </w:r>
       <w:r>
         <w:t>, Methodist</w:t>
@@ -2631,11 +2362,9 @@
       <w:r>
         <w:t xml:space="preserve">The </w:t>
       </w:r>
-      <w:proofErr w:type="spellStart"/>
-      <w:r>
-        <w:t>zion</w:t>
-      </w:r>
-      <w:proofErr w:type="spellEnd"/>
+      <w:r>
+        <w:t>Zion</w:t>
+      </w:r>
       <w:r>
         <w:t xml:space="preserve"> churches have these</w:t>
       </w:r>
@@ -2716,7 +2445,7 @@
           <w:u w:val="single"/>
         </w:rPr>
       </w:pPr>
-      <w:bookmarkStart w:id="2" w:name="_Toc227423379"/>
+      <w:bookmarkStart w:id="2" w:name="_Toc227491226"/>
       <w:r>
         <w:rPr>
           <w:u w:val="single"/>
@@ -2788,7 +2517,7 @@
           <w:u w:val="single"/>
         </w:rPr>
       </w:pPr>
-      <w:bookmarkStart w:id="3" w:name="_Toc227423380"/>
+      <w:bookmarkStart w:id="3" w:name="_Toc227491227"/>
       <w:r>
         <w:rPr>
           <w:u w:val="single"/>
@@ -2861,7 +2590,7 @@
           <w:u w:val="single"/>
         </w:rPr>
       </w:pPr>
-      <w:bookmarkStart w:id="4" w:name="_Toc227423381"/>
+      <w:bookmarkStart w:id="4" w:name="_Toc227491228"/>
       <w:r>
         <w:rPr>
           <w:u w:val="single"/>
@@ -2899,7 +2628,17 @@
         <w:t xml:space="preserve">image of the churches. </w:t>
       </w:r>
       <w:r>
-        <w:t>The key performance indicators for this website are:</w:t>
+        <w:t xml:space="preserve">The </w:t>
+      </w:r>
+      <w:r>
+        <w:rPr>
+          <w:rStyle w:val="Heading3Char"/>
+          <w:u w:val="single"/>
+        </w:rPr>
+        <w:t>key performance indicators</w:t>
+      </w:r>
+      <w:r>
+        <w:t xml:space="preserve"> for this website are:</w:t>
       </w:r>
     </w:p>
     <w:p>
@@ -2989,7 +2728,7 @@
           <w:u w:val="single"/>
         </w:rPr>
       </w:pPr>
-      <w:bookmarkStart w:id="5" w:name="_Toc227423382"/>
+      <w:bookmarkStart w:id="5" w:name="_Toc227491229"/>
       <w:r>
         <w:rPr>
           <w:u w:val="single"/>
@@ -3006,29 +2745,17 @@
     </w:p>
     <w:p>
       <w:r>
-        <w:t>Based </w:t>
-      </w:r>
-      <w:proofErr w:type="spellStart"/>
-      <w:r>
-        <w:t>of</w:t>
-      </w:r>
-      <w:proofErr w:type="spellEnd"/>
-      <w:r>
-        <w:t> my research there are quite a few websites of </w:t>
-      </w:r>
-      <w:proofErr w:type="spellStart"/>
-      <w:r>
-        <w:t>zion</w:t>
-      </w:r>
-      <w:proofErr w:type="spellEnd"/>
+        <w:t>Based of my research there are quite a few websites of </w:t>
+      </w:r>
+      <w:r>
+        <w:t>Zion</w:t>
+      </w:r>
       <w:r>
         <w:t> </w:t>
       </w:r>
-      <w:proofErr w:type="gramStart"/>
-      <w:r>
-        <w:t>churches</w:t>
-      </w:r>
-      <w:proofErr w:type="gramEnd"/>
+      <w:r>
+        <w:t>churches,</w:t>
+      </w:r>
       <w:r>
         <w:t> but they only have ones that represent a certain group such as the Shembe church has the Shembe.net website that solely focuses on the Shembe church. The ZCC and Zion churches that are apostolic or Pentecostal do not have much representation. The strengths I have noticed are a strong visual presence where they are enough images that represent the church, the weakness of the website is that it does not have other similar churches just the ones related to the one church.</w:t>
       </w:r>
@@ -3045,7 +2772,7 @@
           <w:u w:val="single"/>
         </w:rPr>
       </w:pPr>
-      <w:bookmarkStart w:id="6" w:name="_Toc227423383"/>
+      <w:bookmarkStart w:id="6" w:name="_Toc227491230"/>
       <w:r>
         <w:rPr>
           <w:u w:val="single"/>
@@ -3082,13 +2809,8 @@
         <w:t xml:space="preserve">be the first page </w:t>
       </w:r>
       <w:r>
-        <w:t xml:space="preserve">visitors will </w:t>
-      </w:r>
-      <w:proofErr w:type="gramStart"/>
-      <w:r>
-        <w:t>see</w:t>
-      </w:r>
-      <w:proofErr w:type="gramEnd"/>
+        <w:t>visitors will see</w:t>
+      </w:r>
       <w:r>
         <w:t xml:space="preserve"> and it will be the gateway for all the other pages</w:t>
       </w:r>
@@ -3196,7 +2918,7 @@
           <w:u w:val="single"/>
         </w:rPr>
       </w:pPr>
-      <w:bookmarkStart w:id="7" w:name="_Toc227423384"/>
+      <w:bookmarkStart w:id="7" w:name="_Toc227491231"/>
       <w:r>
         <w:rPr>
           <w:u w:val="single"/>
@@ -3212,7 +2934,7 @@
           <w:u w:val="single"/>
         </w:rPr>
       </w:pPr>
-      <w:bookmarkStart w:id="8" w:name="_Toc227423385"/>
+      <w:bookmarkStart w:id="8" w:name="_Toc227491232"/>
       <w:r>
         <w:rPr>
           <w:u w:val="single"/>
@@ -3257,9 +2979,6 @@
     </w:p>
     <w:p>
       <w:r>
-        <w:rPr>
-          <w:noProof/>
-        </w:rPr>
         <w:drawing>
           <wp:inline distT="0" distB="0" distL="0" distR="0" wp14:anchorId="79D60E04" wp14:editId="2A8A18E3">
             <wp:extent cx="3604846" cy="1802423"/>
@@ -3424,7 +3143,7 @@
           <w:u w:val="single"/>
         </w:rPr>
       </w:pPr>
-      <w:bookmarkStart w:id="9" w:name="_Toc227423386"/>
+      <w:bookmarkStart w:id="9" w:name="_Toc227491233"/>
       <w:r>
         <w:rPr>
           <w:u w:val="single"/>
@@ -3465,7 +3184,6 @@
     <w:p>
       <w:r>
         <w:rPr>
-          <w:noProof/>
           <w:u w:val="single"/>
         </w:rPr>
         <mc:AlternateContent>
@@ -3752,7 +3470,7 @@
           </mc:Choice>
           <mc:Fallback>
             <w:pict>
-              <v:group w14:anchorId="2554EC15" id="Group 11" o:spid="_x0000_s1026" style="position:absolute;margin-left:16.6pt;margin-top:12.15pt;width:138.6pt;height:136.6pt;z-index:251673600;mso-height-relative:margin" coordsize="17602,21717" o:gfxdata="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">
+              <v:group w14:anchorId="2456EE6E" id="Group 11" o:spid="_x0000_s1026" style="position:absolute;margin-left:16.6pt;margin-top:12.15pt;width:138.6pt;height:136.6pt;z-index:251673600;mso-height-relative:margin" coordsize="17602,21717" o:gfxdata="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">
                 <v:shapetype id="_x0000_t32" coordsize="21600,21600" o:spt="32" o:oned="t" path="m,l21600,21600e" filled="f">
                   <v:path arrowok="t" fillok="f" o:connecttype="none"/>
                   <o:lock v:ext="edit" shapetype="t"/>
@@ -3788,7 +3506,6 @@
       </w:r>
       <w:r>
         <w:rPr>
-          <w:noProof/>
           <w:u w:val="single"/>
         </w:rPr>
         <mc:AlternateContent>
@@ -3969,7 +3686,7 @@
           <w:u w:val="single"/>
         </w:rPr>
       </w:pPr>
-      <w:bookmarkStart w:id="10" w:name="_Toc227423387"/>
+      <w:bookmarkStart w:id="10" w:name="_Toc227491234"/>
       <w:r>
         <w:rPr>
           <w:u w:val="single"/>
@@ -3996,7 +3713,7 @@
           <w:u w:val="single"/>
         </w:rPr>
       </w:pPr>
-      <w:bookmarkStart w:id="11" w:name="_Toc227423388"/>
+      <w:bookmarkStart w:id="11" w:name="_Toc227491235"/>
       <w:r>
         <w:rPr>
           <w:u w:val="single"/>
@@ -4058,7 +3775,7 @@
           <w:u w:val="single"/>
         </w:rPr>
       </w:pPr>
-      <w:bookmarkStart w:id="12" w:name="_Toc227423389"/>
+      <w:bookmarkStart w:id="12" w:name="_Toc227491236"/>
       <w:r>
         <w:rPr>
           <w:u w:val="single"/>
@@ -4146,7 +3863,7 @@
           <w:u w:val="single"/>
         </w:rPr>
       </w:pPr>
-      <w:bookmarkStart w:id="13" w:name="_Toc227423390"/>
+      <w:bookmarkStart w:id="13" w:name="_Toc227491237"/>
       <w:r>
         <w:rPr>
           <w:u w:val="single"/>
@@ -4160,25 +3877,7 @@
         <w:t>The content that is going to be on the website is images, videos and information related to the organisation.</w:t>
       </w:r>
       <w:r>
-        <w:t xml:space="preserve"> Most websites from my research offer shared testimonials so there will be a section dedicated to</w:t>
-      </w:r>
-      <w:r>
-        <w:t xml:space="preserve"> </w:t>
-      </w:r>
-      <w:r>
-        <w:t>s</w:t>
-      </w:r>
-      <w:r>
-        <w:t>haring testimonials and stories from the congregation</w:t>
-      </w:r>
-      <w:r>
-        <w:t xml:space="preserve"> which</w:t>
-      </w:r>
-      <w:r>
-        <w:t xml:space="preserve"> can build trust and inspire new visitors. This includes member testimonials, success stories from ministries, and video testimonials for a more personal touch.</w:t>
-      </w:r>
-      <w:r>
-        <w:t xml:space="preserve"> (The Church Co,2024)</w:t>
+        <w:t xml:space="preserve"> Most websites from my research offer shared testimonials so there will be a section dedicated to sharing testimonials and stories from the congregation which can build trust and inspire new visitors. This includes member testimonials, success stories from ministries, and video testimonials for a more personal touch. (The Church Co,2024)</w:t>
       </w:r>
     </w:p>
     <w:p>
@@ -4188,7 +3887,7 @@
           <w:u w:val="single"/>
         </w:rPr>
       </w:pPr>
-      <w:bookmarkStart w:id="14" w:name="_Toc227423391"/>
+      <w:bookmarkStart w:id="14" w:name="_Toc227491238"/>
       <w:r>
         <w:rPr>
           <w:u w:val="single"/>
@@ -4204,7 +3903,7 @@
           <w:u w:val="single"/>
         </w:rPr>
       </w:pPr>
-      <w:bookmarkStart w:id="15" w:name="_Toc227423392"/>
+      <w:bookmarkStart w:id="15" w:name="_Toc227491239"/>
       <w:r>
         <w:rPr>
           <w:u w:val="single"/>
@@ -4221,9 +3920,6 @@
     </w:p>
     <w:p>
       <w:r>
-        <w:rPr>
-          <w:noProof/>
-        </w:rPr>
         <w:drawing>
           <wp:inline distT="0" distB="0" distL="0" distR="0" wp14:anchorId="382434E1" wp14:editId="78300BD9">
             <wp:extent cx="3738563" cy="1924050"/>
@@ -4246,7 +3942,7 @@
           <w:u w:val="single"/>
         </w:rPr>
       </w:pPr>
-      <w:bookmarkStart w:id="16" w:name="_Toc227423393"/>
+      <w:bookmarkStart w:id="16" w:name="_Toc227491240"/>
       <w:r>
         <w:rPr>
           <w:u w:val="single"/>
@@ -4275,7 +3971,7 @@
           <w:numId w:val="6"/>
         </w:numPr>
       </w:pPr>
-      <w:bookmarkStart w:id="17" w:name="_Toc227423394"/>
+      <w:bookmarkStart w:id="17" w:name="_Toc227491241"/>
       <w:r>
         <w:t>Homepage</w:t>
       </w:r>
@@ -4285,14 +3981,9 @@
       <w:r>
         <w:t xml:space="preserve">Welcome </w:t>
       </w:r>
-      <w:proofErr w:type="gramStart"/>
-      <w:r>
-        <w:t xml:space="preserve">message, </w:t>
-      </w:r>
-      <w:r>
-        <w:t xml:space="preserve"> brief</w:t>
-      </w:r>
-      <w:proofErr w:type="gramEnd"/>
+      <w:r>
+        <w:t>message, brief</w:t>
+      </w:r>
       <w:r>
         <w:t xml:space="preserve"> message</w:t>
       </w:r>
@@ -4308,7 +3999,7 @@
           <w:numId w:val="6"/>
         </w:numPr>
       </w:pPr>
-      <w:bookmarkStart w:id="18" w:name="_Toc227423395"/>
+      <w:bookmarkStart w:id="18" w:name="_Toc227491242"/>
       <w:r>
         <w:lastRenderedPageBreak/>
         <w:t>About us</w:t>
@@ -4340,9 +4031,6 @@
         <w:keepNext/>
       </w:pPr>
       <w:r>
-        <w:rPr>
-          <w:noProof/>
-        </w:rPr>
         <w:drawing>
           <wp:inline distT="0" distB="0" distL="0" distR="0" wp14:anchorId="7DD74077" wp14:editId="3691C1D6">
             <wp:extent cx="3552092" cy="1928628"/>
@@ -4389,9 +4077,6 @@
       </w:r>
       <w:fldSimple w:instr=" SEQ Figure \* ARABIC ">
         <w:r>
-          <w:rPr>
-            <w:noProof/>
-          </w:rPr>
           <w:t>1</w:t>
         </w:r>
       </w:fldSimple>
@@ -4404,9 +4089,6 @@
         <w:keepNext/>
       </w:pPr>
       <w:r>
-        <w:rPr>
-          <w:noProof/>
-        </w:rPr>
         <w:drawing>
           <wp:inline distT="0" distB="0" distL="0" distR="0" wp14:anchorId="307F73B5" wp14:editId="46A1FEC9">
             <wp:extent cx="2174631" cy="2898625"/>
@@ -4459,9 +4141,6 @@
       </w:r>
       <w:fldSimple w:instr=" SEQ Figure \* ARABIC ">
         <w:r>
-          <w:rPr>
-            <w:noProof/>
-          </w:rPr>
           <w:t>2</w:t>
         </w:r>
       </w:fldSimple>
@@ -4487,9 +4166,6 @@
     </w:p>
     <w:p>
       <w:r>
-        <w:rPr>
-          <w:noProof/>
-        </w:rPr>
         <w:lastRenderedPageBreak/>
         <w:drawing>
           <wp:inline distT="0" distB="0" distL="0" distR="0" wp14:anchorId="0E5F64D9" wp14:editId="0563E3C9">
@@ -4543,9 +4219,6 @@
       </w:r>
       <w:fldSimple w:instr=" SEQ Figure \* ARABIC ">
         <w:r>
-          <w:rPr>
-            <w:noProof/>
-          </w:rPr>
           <w:t>3</w:t>
         </w:r>
       </w:fldSimple>
@@ -4562,7 +4235,7 @@
           <w:numId w:val="6"/>
         </w:numPr>
       </w:pPr>
-      <w:bookmarkStart w:id="19" w:name="_Toc227423396"/>
+      <w:bookmarkStart w:id="19" w:name="_Toc227491243"/>
       <w:r>
         <w:t>Directory</w:t>
       </w:r>
@@ -4584,9 +4257,6 @@
         <w:keepNext/>
       </w:pPr>
       <w:r>
-        <w:rPr>
-          <w:noProof/>
-        </w:rPr>
         <w:drawing>
           <wp:inline distT="0" distB="0" distL="0" distR="0" wp14:anchorId="786C52CC" wp14:editId="7795BDDF">
             <wp:extent cx="2276475" cy="1517566"/>
@@ -4639,9 +4309,6 @@
       </w:r>
       <w:fldSimple w:instr=" SEQ Figure \* ARABIC ">
         <w:r>
-          <w:rPr>
-            <w:noProof/>
-          </w:rPr>
           <w:t>4</w:t>
         </w:r>
       </w:fldSimple>
@@ -4654,9 +4321,6 @@
         <w:keepNext/>
       </w:pPr>
       <w:r>
-        <w:rPr>
-          <w:noProof/>
-        </w:rPr>
         <w:drawing>
           <wp:inline distT="0" distB="0" distL="0" distR="0" wp14:anchorId="1A93B902" wp14:editId="302D44A4">
             <wp:extent cx="2019300" cy="1491175"/>
@@ -4709,9 +4373,6 @@
       </w:r>
       <w:fldSimple w:instr=" SEQ Figure \* ARABIC ">
         <w:r>
-          <w:rPr>
-            <w:noProof/>
-          </w:rPr>
           <w:t>5</w:t>
         </w:r>
       </w:fldSimple>
@@ -4724,9 +4385,6 @@
         <w:keepNext/>
       </w:pPr>
       <w:r>
-        <w:rPr>
-          <w:noProof/>
-        </w:rPr>
         <w:lastRenderedPageBreak/>
         <w:drawing>
           <wp:inline distT="0" distB="0" distL="0" distR="0" wp14:anchorId="5329F787" wp14:editId="1DACF910">
@@ -4780,9 +4438,6 @@
       </w:r>
       <w:fldSimple w:instr=" SEQ Figure \* ARABIC ">
         <w:r>
-          <w:rPr>
-            <w:noProof/>
-          </w:rPr>
           <w:t>6</w:t>
         </w:r>
       </w:fldSimple>
@@ -4795,9 +4450,6 @@
         <w:keepNext/>
       </w:pPr>
       <w:r>
-        <w:rPr>
-          <w:noProof/>
-        </w:rPr>
         <w:drawing>
           <wp:inline distT="0" distB="0" distL="0" distR="0" wp14:anchorId="5237D358" wp14:editId="1B5E5400">
             <wp:extent cx="1219200" cy="2166742"/>
@@ -4850,9 +4502,6 @@
       </w:r>
       <w:fldSimple w:instr=" SEQ Figure \* ARABIC ">
         <w:r>
-          <w:rPr>
-            <w:noProof/>
-          </w:rPr>
           <w:t>7</w:t>
         </w:r>
       </w:fldSimple>
@@ -4868,7 +4517,7 @@
           <w:numId w:val="6"/>
         </w:numPr>
       </w:pPr>
-      <w:bookmarkStart w:id="20" w:name="_Toc227423397"/>
+      <w:bookmarkStart w:id="20" w:name="_Toc227491244"/>
       <w:r>
         <w:t>Photo gallery</w:t>
       </w:r>
@@ -4905,7 +4554,7 @@
           <w:numId w:val="6"/>
         </w:numPr>
       </w:pPr>
-      <w:bookmarkStart w:id="21" w:name="_Toc227423398"/>
+      <w:bookmarkStart w:id="21" w:name="_Toc227491245"/>
       <w:r>
         <w:t>Devotions</w:t>
       </w:r>
@@ -4924,7 +4573,7 @@
           <w:numId w:val="6"/>
         </w:numPr>
       </w:pPr>
-      <w:bookmarkStart w:id="22" w:name="_Toc227423399"/>
+      <w:bookmarkStart w:id="22" w:name="_Toc227491246"/>
       <w:r>
         <w:t>Contact Us</w:t>
       </w:r>
@@ -4945,7 +4594,7 @@
           <w:u w:val="single"/>
         </w:rPr>
       </w:pPr>
-      <w:bookmarkStart w:id="23" w:name="_Toc227423400"/>
+      <w:bookmarkStart w:id="23" w:name="_Toc227491247"/>
       <w:r>
         <w:rPr>
           <w:u w:val="single"/>
@@ -5018,6 +4667,7 @@
     <w:p/>
     <w:p/>
     <w:p/>
+    <w:p/>
     <w:p>
       <w:pPr>
         <w:pStyle w:val="Heading1"/>
@@ -5025,11 +4675,12 @@
           <w:u w:val="single"/>
         </w:rPr>
       </w:pPr>
-      <w:bookmarkStart w:id="24" w:name="_Toc227423401"/>
+      <w:bookmarkStart w:id="24" w:name="_Toc227491248"/>
       <w:r>
         <w:rPr>
           <w:u w:val="single"/>
         </w:rPr>
+        <w:lastRenderedPageBreak/>
         <w:t>References</w:t>
       </w:r>
       <w:bookmarkEnd w:id="24"/>
@@ -5063,7 +4714,6 @@
     </w:p>
     <w:p>
       <w:r>
-        <w:lastRenderedPageBreak/>
         <w:t xml:space="preserve">New religious movements, 2025 Zionist churches. [online] available at </w:t>
       </w:r>
       <w:hyperlink r:id="rId30" w:history="1">
@@ -5091,15 +4741,7 @@
     </w:p>
     <w:p>
       <w:r>
-        <w:t xml:space="preserve">Logo, 2026. </w:t>
-      </w:r>
-      <w:proofErr w:type="gramStart"/>
-      <w:r>
-        <w:t>( the</w:t>
-      </w:r>
-      <w:proofErr w:type="gramEnd"/>
-      <w:r>
-        <w:t xml:space="preserve"> image was generated by </w:t>
+        <w:t xml:space="preserve">Logo, 2026. ( the image was generated by </w:t>
       </w:r>
       <w:proofErr w:type="spellStart"/>
       <w:r>
@@ -5151,10 +4793,7 @@
     </w:p>
     <w:p>
       <w:r>
-        <w:t>M3ga Arts. Brought together by prayer and worship. [online] available at h</w:t>
-      </w:r>
-      <w:r>
-        <w:t>ttps://za.pinterest.com/pin/744642119677141228/</w:t>
+        <w:t>M3ga Arts. Brought together by prayer and worship. [online] available at https://za.pinterest.com/pin/744642119677141228/</w:t>
       </w:r>
     </w:p>
     <w:p>
@@ -5188,10 +4827,7 @@
       </w:r>
       <w:proofErr w:type="spellEnd"/>
       <w:r>
-        <w:t xml:space="preserve"> SANELE MATSOLO</w:t>
-      </w:r>
-      <w:r>
-        <w:t xml:space="preserve">. [online] available at </w:t>
+        <w:t xml:space="preserve"> SANELE MATSOLO. [online] available at </w:t>
       </w:r>
       <w:hyperlink r:id="rId34" w:history="1">
         <w:r>
@@ -5233,10 +4869,7 @@
       </w:r>
       <w:proofErr w:type="spellEnd"/>
       <w:r>
-        <w:t xml:space="preserve"> Nteleza. [online] available at https://za.pinterest.com/pin/</w:t>
-      </w:r>
-      <w:r>
-        <w:t>702702348154611783/</w:t>
+        <w:t xml:space="preserve"> Nteleza. [online] available at https://za.pinterest.com/pin/702702348154611783/</w:t>
       </w:r>
     </w:p>
     <w:p>
@@ -5262,10 +4895,7 @@
       </w:r>
       <w:proofErr w:type="spellEnd"/>
       <w:r>
-        <w:t xml:space="preserve"> Botswana, 2021. ZCC to remain closed. [online] available at </w:t>
-      </w:r>
-      <w:r>
-        <w:t>www.thegazette.news/news/zcc-to-remain-closed/</w:t>
+        <w:t xml:space="preserve"> Botswana, 2021. ZCC to remain closed. [online] available at www.thegazette.news/news/zcc-to-remain-closed/</w:t>
       </w:r>
     </w:p>
     <w:p>
@@ -5377,7 +5007,6 @@
               <w:rPr>
                 <w:b/>
                 <w:bCs/>
-                <w:noProof/>
               </w:rPr>
               <w:t>2</w:t>
             </w:r>
@@ -5422,7 +5051,6 @@
               <w:rPr>
                 <w:b/>
                 <w:bCs/>
-                <w:noProof/>
               </w:rPr>
               <w:t>2</w:t>
             </w:r>
@@ -12983,9 +12611,9 @@
     <w:rsid w:val="00240037"/>
     <w:rsid w:val="003C6B6F"/>
     <w:rsid w:val="00487BA5"/>
-    <w:rsid w:val="004C60E0"/>
     <w:rsid w:val="004D746C"/>
     <w:rsid w:val="004F2BF5"/>
+    <w:rsid w:val="006E31B7"/>
     <w:rsid w:val="0072716C"/>
     <w:rsid w:val="0091224C"/>
     <w:rsid w:val="0095784B"/>

</xml_diff>